<commit_message>
updates fairness script to use map
</commit_message>
<xml_diff>
--- a/docs/index.docx
+++ b/docs/index.docx
@@ -155,7 +155,7 @@
         <w:pStyle w:val="Date"/>
       </w:pPr>
       <w:r>
-        <w:t xml:space="preserve">2024-06-18</w:t>
+        <w:t xml:space="preserve">2024-06-20</w:t>
       </w:r>
     </w:p>
     <w:p>
@@ -357,16 +357,34 @@
         <w:t xml:space="preserve">(DeRubeis 2019)</w:t>
       </w:r>
       <w:r>
-        <w:t xml:space="preserve">. Today, this approach is also applied to chronic mental health conditions, like substance use disorders (i.e., precision mental health). Precision mental health uses individual characteristics to guide initial treatment matching and adaptive continuing care over time. It requires dense, long-term monitoring of symptoms and related states, for interventions to be tailored to an individual’s needs and preferences at any given moment</w:t>
-      </w:r>
-      <w:r>
-        <w:t xml:space="preserve"> </w:t>
-      </w:r>
-      <w:r>
-        <w:t xml:space="preserve">(Bickman, Lyon, and Wolpert 2016)</w:t>
-      </w:r>
-      <w:r>
-        <w:t xml:space="preserve">. Essentially, it aims to identify both</w:t>
+        <w:t xml:space="preserve">. Traditionally, precision medicine seeks to answer</w:t>
+      </w:r>
+      <w:r>
+        <w:t xml:space="preserve"> </w:t>
+      </w:r>
+      <w:r>
+        <w:rPr>
+          <w:i/>
+          <w:iCs/>
+        </w:rPr>
+        <w:t xml:space="preserve">how</w:t>
+      </w:r>
+      <w:r>
+        <w:t xml:space="preserve"> </w:t>
+      </w:r>
+      <w:r>
+        <w:t xml:space="preserve">do we best treat a specific individual (e.g., which medication will work best for an individual given their unique background, preferences, and medical history).</w:t>
+      </w:r>
+    </w:p>
+    <w:p>
+      <w:pPr>
+        <w:pStyle w:val="BodyText"/>
+      </w:pPr>
+      <w:r>
+        <w:t xml:space="preserve">Today, this approach is also applied to chronic mental health conditions (i.e., precision mental health), like depression, substance use disorders, and suicide [</w:t>
+      </w:r>
+      <w:r>
+        <w:t xml:space="preserve">]. However, mental health conditions are complex fluctuating processes. Unlike medical conditions that have clear biological precursors, mental health conditions are products of lots of psychosocial factors. These factors differ between individuals and within an individual over time. Additionally, there are a wide array of psychosocial supports available for clinicians to select from. Thus, precision mental health must consider both the</w:t>
       </w:r>
       <w:r>
         <w:t xml:space="preserve"> </w:t>
@@ -382,7 +400,7 @@
         <w:t xml:space="preserve"> </w:t>
       </w:r>
       <w:r>
-        <w:t xml:space="preserve">and</w:t>
+        <w:t xml:space="preserve">and the</w:t>
       </w:r>
       <w:r>
         <w:t xml:space="preserve"> </w:t>
@@ -395,10 +413,7 @@
         <w:t xml:space="preserve">how</w:t>
       </w:r>
       <w:r>
-        <w:t xml:space="preserve"> </w:t>
-      </w:r>
-      <w:r>
-        <w:t xml:space="preserve">to intervene.</w:t>
+        <w:t xml:space="preserve">.</w:t>
       </w:r>
     </w:p>
     <w:p>
@@ -406,13 +421,35 @@
         <w:pStyle w:val="BodyText"/>
       </w:pPr>
       <w:r>
-        <w:t xml:space="preserve">Recent advances in both personal sensing and machine learning may address both of these barriers to successful precision mental health.</w:t>
-      </w:r>
-      <w:r>
-        <w:t xml:space="preserve"> </w:t>
-      </w:r>
-      <w:r>
-        <w:t xml:space="preserve"> </w:t>
+        <w:t xml:space="preserve">There has been long-standing interest in precision mental health and substance use disorders. In an early example, The Project MATCH research group attempted to match individuals with alcohol use disorder to their optimal treatment based on baseline measures of individual differences</w:t>
+      </w:r>
+      <w:r>
+        <w:t xml:space="preserve"> </w:t>
+      </w:r>
+      <w:r>
+        <w:t xml:space="preserve">(</w:t>
+      </w:r>
+      <w:r>
+        <w:rPr>
+          <w:b/>
+          <w:bCs/>
+        </w:rPr>
+        <w:t xml:space="preserve">projectmatchresearchgroupMatchingAlcoholismTreatments1997?</w:t>
+      </w:r>
+      <w:r>
+        <w:t xml:space="preserve">)</w:t>
+      </w:r>
+      <w:r>
+        <w:t xml:space="preserve">. The study failed to find any differences in treatment success. This can likely be attributed to low dimensional analyses that failed to capture to the complex and heterogeneous nature of substance use disorders and their use of static distal features to predict a non-linear time-varying course of recovery, lapse, and relapse</w:t>
+      </w:r>
+      <w:r>
+        <w:t xml:space="preserve"> </w:t>
+      </w:r>
+      <w:r>
+        <w:t xml:space="preserve">(Witkiewitz and Marlatt 2007)</w:t>
+      </w:r>
+      <w:r>
+        <w:t xml:space="preserve">.</w:t>
       </w:r>
     </w:p>
     <w:p>
@@ -420,19 +457,15 @@
         <w:pStyle w:val="BodyText"/>
       </w:pPr>
       <w:r>
-        <w:t xml:space="preserve">Personal sensing allows for frequent, longitudinal monitoring of individuals’ affect, behavior, and cognitions in their day-to-day lives</w:t>
-      </w:r>
-      <w:r>
-        <w:t xml:space="preserve"> </w:t>
-      </w:r>
-      <w:r>
-        <w:t xml:space="preserve">(Mohr, Zhang, and Schueller 2017)</w:t>
-      </w:r>
-      <w:r>
-        <w:t xml:space="preserve">. These data can then be used as inputs for machine learning algorithms to predict the probability of specific outcomes (e.g., lapse risk) and identify the top features contributing to those predictions.</w:t>
-      </w:r>
-      <w:r>
-        <w:t xml:space="preserve"> </w:t>
+        <w:t xml:space="preserve">Take the example of lapses, discrete instances of goal inconsistent substance use. Lapses are a clinically important target for substance use treatment. They are often an early warning sign of relapse, maladaptive responses to lapses can undermine recovery, and for some substances a single lapse can result in an overdose and/or death. It would be unreasonable to expect that we could predict a lapse with any temporal precision using only features that become more distal as time progresses. Lapse prediction requires dense, long-term monitoring of symptoms and related states proximal to the outcome.</w:t>
+      </w:r>
+    </w:p>
+    <w:p>
+      <w:pPr>
+        <w:pStyle w:val="BodyText"/>
+      </w:pPr>
+      <w:r>
+        <w:t xml:space="preserve">Recent advances in both personal sensing and machine learning may address both of these barriers to successful precision mental health. Personal sensing allows for frequent, longitudinal measurement of changes in proximal risk (e.g., lapse) with high temporal precision. Machine learning allows for high dimensional inputs. Moreover, tools from machine learning can be applied to models to understand which factors are specific to a specific individual at a specific moment in time.</w:t>
       </w:r>
     </w:p>
     <w:p>
@@ -520,7 +553,7 @@
       </w:r>
     </w:p>
     <w:bookmarkEnd w:id="21"/>
-    <w:bookmarkStart w:id="102" w:name="methods"/>
+    <w:bookmarkStart w:id="100" w:name="methods"/>
     <w:p>
       <w:pPr>
         <w:pStyle w:val="Heading1"/>
@@ -1123,7 +1156,7 @@
         <w:t xml:space="preserve">(Olfson et al. 2022)</w:t>
       </w:r>
       <w:r>
-        <w:t xml:space="preserve">, and sex (male vs. female)</w:t>
+        <w:t xml:space="preserve">, and sex at birth (male vs. female)</w:t>
       </w:r>
       <w:r>
         <w:t xml:space="preserve"> </w:t>
@@ -4257,14 +4290,14 @@
             <w:r>
               <w:drawing>
                 <wp:inline>
-                  <wp:extent cx="5334000" cy="3809999"/>
+                  <wp:extent cx="5334000" cy="3810000"/>
                   <wp:effectExtent b="0" l="0" r="0" t="0"/>
                   <wp:docPr descr="" title="" id="45" name="Picture"/>
                   <a:graphic>
                     <a:graphicData uri="http://schemas.openxmlformats.org/drawingml/2006/picture">
                       <pic:pic>
                         <pic:nvPicPr>
-                          <pic:cNvPr descr="index_files/figure-docx/notebooks-mak_figs-fig-auroc-output-1.png" id="46" name="Picture"/>
+                          <pic:cNvPr descr="index_files/figure-docx/notebooks-model_evaluation-fig-auroc-output-1.png" id="46" name="Picture"/>
                           <pic:cNvPicPr>
                             <a:picLocks noChangeArrowheads="1" noChangeAspect="1"/>
                           </pic:cNvPicPr>
@@ -4278,7 +4311,7 @@
                         <pic:spPr bwMode="auto">
                           <a:xfrm>
                             <a:off x="0" y="0"/>
-                            <a:ext cx="5334000" cy="3809999"/>
+                            <a:ext cx="5334000" cy="3810000"/>
                           </a:xfrm>
                           <a:prstGeom prst="rect">
                             <a:avLst/>
@@ -4336,7 +4369,7 @@
             <w:rStyle w:val="Hyperlink"/>
             <w:vertAlign w:val="subscript"/>
           </w:rPr>
-          <w:t xml:space="preserve">Make Figures</w:t>
+          <w:t xml:space="preserve">Model evaluation</w:t>
         </w:r>
       </w:hyperlink>
     </w:p>
@@ -4412,7 +4445,7 @@
         <w:t xml:space="preserve"> </w:t>
       </w:r>
       <w:r>
-        <w:t xml:space="preserve">shows the difference in performance of each model by demographic group. All group comparisons for race, sex, and income were significant (probability &gt; .95) across models. On average there was a median increase in auROC for white participants compared to participants who were not white of 0.159. On average there was a median increase in auROC for male participants compared to female participants of 0.080. On average there was a median increase in auROC for participants above the federal poverty line compared to participants below the federal poverty line of 0.092.</w:t>
+        <w:t xml:space="preserve">shows the difference in performance of each model by demographic group. All group comparisons for race, sex, and income were significant (probability &gt; .95) across models. On average there was a median increase in auROC for white participants compared to participants who were not white of 0.159 (range 0.107-0.179). On average there was a median increase in auROC for male participants compared to female participants of (range 0.059-0.116). On average there was a median increase in auROC for participants above the federal poverty line compared to participants below the federal poverty line of 0.092 (range 0.086-0.133).</w:t>
       </w:r>
     </w:p>
     <w:tbl>
@@ -4437,7 +4470,7 @@
             <w:r>
               <w:drawing>
                 <wp:inline>
-                  <wp:extent cx="5334000" cy="3809999"/>
+                  <wp:extent cx="5334000" cy="3810000"/>
                   <wp:effectExtent b="0" l="0" r="0" t="0"/>
                   <wp:docPr descr="" title="" id="54" name="Picture"/>
                   <a:graphic>
@@ -4458,7 +4491,7 @@
                         <pic:spPr bwMode="auto">
                           <a:xfrm>
                             <a:off x="0" y="0"/>
-                            <a:ext cx="5334000" cy="3809999"/>
+                            <a:ext cx="5334000" cy="3810000"/>
                           </a:xfrm>
                           <a:prstGeom prst="rect">
                             <a:avLst/>
@@ -4543,18 +4576,39 @@
     </w:p>
     <w:p>
       <w:pPr>
-        <w:pStyle w:val="Compact"/>
         <w:numPr>
           <w:ilvl w:val="0"/>
           <w:numId w:val="1003"/>
         </w:numPr>
       </w:pPr>
       <w:r>
+        <w:t xml:space="preserve">Model degrades, but perhaps not meaningfully even down to two weeks out.</w:t>
+      </w:r>
+    </w:p>
+    <w:p>
+      <w:pPr>
+        <w:numPr>
+          <w:ilvl w:val="0"/>
+          <w:numId w:val="1003"/>
+        </w:numPr>
+      </w:pPr>
+      <w:r>
+        <w:t xml:space="preserve">All models were worse for women and people were not white and below poverty line.</w:t>
+      </w:r>
+    </w:p>
+    <w:p>
+      <w:pPr>
+        <w:numPr>
+          <w:ilvl w:val="0"/>
+          <w:numId w:val="1003"/>
+        </w:numPr>
+      </w:pPr>
+      <w:r>
         <w:t xml:space="preserve">Improving model performance for unprivileged classes. Considering other important classes for SUD, such as geographic location, Improving diversity of training data</w:t>
       </w:r>
     </w:p>
     <w:bookmarkEnd w:id="61"/>
-    <w:bookmarkStart w:id="101" w:name="references"/>
+    <w:bookmarkStart w:id="99" w:name="references"/>
     <w:p>
       <w:pPr>
         <w:pStyle w:val="Heading2"/>
@@ -4563,7 +4617,7 @@
         <w:t xml:space="preserve">References</w:t>
       </w:r>
     </w:p>
-    <w:bookmarkStart w:id="100" w:name="refs"/>
+    <w:bookmarkStart w:id="98" w:name="refs"/>
     <w:bookmarkStart w:id="63" w:name="ref-baeMobilePhoneSensors2018"/>
     <w:p>
       <w:pPr>
@@ -4622,115 +4676,30 @@
       </w:r>
     </w:p>
     <w:bookmarkEnd w:id="63"/>
-    <w:bookmarkStart w:id="65" w:name="ref-bickmanAchievingPrecisionMental2016a"/>
+    <w:bookmarkStart w:id="65" w:name="ref-chtc"/>
     <w:p>
       <w:pPr>
         <w:pStyle w:val="Bibliography"/>
       </w:pPr>
       <w:r>
-        <w:t xml:space="preserve">Bickman, Leonard, Aaron R. Lyon, and Miranda Wolpert. 2016.</w:t>
-      </w:r>
-      <w:r>
-        <w:t xml:space="preserve"> </w:t>
-      </w:r>
-      <w:r>
-        <w:t xml:space="preserve">“Achieving</w:t>
-      </w:r>
-      <w:r>
-        <w:t xml:space="preserve"> </w:t>
-      </w:r>
-      <w:r>
-        <w:t xml:space="preserve">Precision Mental Health</w:t>
-      </w:r>
-      <w:r>
-        <w:t xml:space="preserve"> </w:t>
-      </w:r>
-      <w:r>
-        <w:t xml:space="preserve">Through</w:t>
-      </w:r>
-      <w:r>
-        <w:t xml:space="preserve"> </w:t>
-      </w:r>
-      <w:r>
-        <w:t xml:space="preserve">Effective Assessment</w:t>
-      </w:r>
-      <w:r>
-        <w:t xml:space="preserve">,</w:t>
-      </w:r>
-      <w:r>
-        <w:t xml:space="preserve"> </w:t>
-      </w:r>
-      <w:r>
-        <w:t xml:space="preserve">Monitoring</w:t>
-      </w:r>
-      <w:r>
-        <w:t xml:space="preserve">, and</w:t>
-      </w:r>
-      <w:r>
-        <w:t xml:space="preserve"> </w:t>
-      </w:r>
-      <w:r>
-        <w:t xml:space="preserve">Feedback Processes</w:t>
-      </w:r>
-      <w:r>
-        <w:t xml:space="preserve">.”</w:t>
-      </w:r>
-      <w:r>
-        <w:t xml:space="preserve"> </w:t>
-      </w:r>
-      <w:r>
-        <w:rPr>
-          <w:i/>
-          <w:iCs/>
-        </w:rPr>
-        <w:t xml:space="preserve">Administration and Policy in Mental Health and Mental Health Services Research</w:t>
-      </w:r>
-      <w:r>
-        <w:t xml:space="preserve"> </w:t>
-      </w:r>
-      <w:r>
-        <w:t xml:space="preserve">43 (3): 271–76.</w:t>
+        <w:t xml:space="preserve">Center for High Throughput Computing. 2006.</w:t>
+      </w:r>
+      <w:r>
+        <w:t xml:space="preserve"> </w:t>
+      </w:r>
+      <w:r>
+        <w:t xml:space="preserve">“Center for High Throughput Computing.”</w:t>
+      </w:r>
+      <w:r>
+        <w:t xml:space="preserve"> </w:t>
+      </w:r>
+      <w:r>
+        <w:t xml:space="preserve">Center for High Throughput Computing.</w:t>
       </w:r>
       <w:r>
         <w:t xml:space="preserve"> </w:t>
       </w:r>
       <w:hyperlink r:id="rId64">
-        <w:r>
-          <w:rPr>
-            <w:rStyle w:val="Hyperlink"/>
-          </w:rPr>
-          <w:t xml:space="preserve">https://doi.org/10.1007/s10488-016-0718-5</w:t>
-        </w:r>
-      </w:hyperlink>
-      <w:r>
-        <w:t xml:space="preserve">.</w:t>
-      </w:r>
-    </w:p>
-    <w:bookmarkEnd w:id="65"/>
-    <w:bookmarkStart w:id="67" w:name="ref-chtc"/>
-    <w:p>
-      <w:pPr>
-        <w:pStyle w:val="Bibliography"/>
-      </w:pPr>
-      <w:r>
-        <w:t xml:space="preserve">Center for High Throughput Computing. 2006.</w:t>
-      </w:r>
-      <w:r>
-        <w:t xml:space="preserve"> </w:t>
-      </w:r>
-      <w:r>
-        <w:t xml:space="preserve">“Center for High Throughput Computing.”</w:t>
-      </w:r>
-      <w:r>
-        <w:t xml:space="preserve"> </w:t>
-      </w:r>
-      <w:r>
-        <w:t xml:space="preserve">Center for High Throughput Computing.</w:t>
-      </w:r>
-      <w:r>
-        <w:t xml:space="preserve"> </w:t>
-      </w:r>
-      <w:hyperlink r:id="rId66">
         <w:r>
           <w:rPr>
             <w:rStyle w:val="Hyperlink"/>
@@ -4742,8 +4711,8 @@
         <w:t xml:space="preserve">.</w:t>
       </w:r>
     </w:p>
-    <w:bookmarkEnd w:id="67"/>
-    <w:bookmarkStart w:id="69" w:name="ref-chihPredictiveModelingAddiction2014"/>
+    <w:bookmarkEnd w:id="65"/>
+    <w:bookmarkStart w:id="67" w:name="ref-chihPredictiveModelingAddiction2014"/>
     <w:p>
       <w:pPr>
         <w:pStyle w:val="Bibliography"/>
@@ -4776,7 +4745,7 @@
       <w:r>
         <w:t xml:space="preserve"> </w:t>
       </w:r>
-      <w:hyperlink r:id="rId68">
+      <w:hyperlink r:id="rId66">
         <w:r>
           <w:rPr>
             <w:rStyle w:val="Hyperlink"/>
@@ -4788,8 +4757,8 @@
         <w:t xml:space="preserve">.</w:t>
       </w:r>
     </w:p>
-    <w:bookmarkEnd w:id="69"/>
-    <w:bookmarkStart w:id="71" w:name="ref-derubeisHistoryCurrentStatus2019"/>
+    <w:bookmarkEnd w:id="67"/>
+    <w:bookmarkStart w:id="69" w:name="ref-derubeisHistoryCurrentStatus2019"/>
     <w:p>
       <w:pPr>
         <w:pStyle w:val="Bibliography"/>
@@ -4822,7 +4791,7 @@
       <w:r>
         <w:t xml:space="preserve"> </w:t>
       </w:r>
-      <w:hyperlink r:id="rId70">
+      <w:hyperlink r:id="rId68">
         <w:r>
           <w:rPr>
             <w:rStyle w:val="Hyperlink"/>
@@ -4834,8 +4803,8 @@
         <w:t xml:space="preserve">.</w:t>
       </w:r>
     </w:p>
-    <w:bookmarkEnd w:id="71"/>
-    <w:bookmarkStart w:id="73" w:name="Xa203ab3abd150ead1a7854a9fa5726c8a273f52"/>
+    <w:bookmarkEnd w:id="69"/>
+    <w:bookmarkStart w:id="71" w:name="Xa203ab3abd150ead1a7854a9fa5726c8a273f52"/>
     <w:p>
       <w:pPr>
         <w:pStyle w:val="Bibliography"/>
@@ -4880,7 +4849,7 @@
       <w:r>
         <w:t xml:space="preserve"> </w:t>
       </w:r>
-      <w:hyperlink r:id="rId72">
+      <w:hyperlink r:id="rId70">
         <w:r>
           <w:rPr>
             <w:rStyle w:val="Hyperlink"/>
@@ -4892,8 +4861,8 @@
         <w:t xml:space="preserve">.</w:t>
       </w:r>
     </w:p>
-    <w:bookmarkEnd w:id="73"/>
-    <w:bookmarkStart w:id="74" w:name="ref-hsiehSampleSizeTables1989"/>
+    <w:bookmarkEnd w:id="71"/>
+    <w:bookmarkStart w:id="72" w:name="ref-hsiehSampleSizeTables1989"/>
     <w:p>
       <w:pPr>
         <w:pStyle w:val="Bibliography"/>
@@ -4924,8 +4893,8 @@
         <w:t xml:space="preserve">8: 795–802.</w:t>
       </w:r>
     </w:p>
-    <w:bookmarkEnd w:id="74"/>
-    <w:bookmarkStart w:id="76" w:name="ref-kilaruIncidenceTreatmentOpioid2020"/>
+    <w:bookmarkEnd w:id="72"/>
+    <w:bookmarkStart w:id="74" w:name="ref-kilaruIncidenceTreatmentOpioid2020"/>
     <w:p>
       <w:pPr>
         <w:pStyle w:val="Bibliography"/>
@@ -4991,7 +4960,7 @@
       <w:r>
         <w:t xml:space="preserve"> </w:t>
       </w:r>
-      <w:hyperlink r:id="rId75">
+      <w:hyperlink r:id="rId73">
         <w:r>
           <w:rPr>
             <w:rStyle w:val="Hyperlink"/>
@@ -5003,8 +4972,8 @@
         <w:t xml:space="preserve">.</w:t>
       </w:r>
     </w:p>
-    <w:bookmarkEnd w:id="76"/>
-    <w:bookmarkStart w:id="78" w:name="ref-kuhnAppliedPredictiveModeling2018"/>
+    <w:bookmarkEnd w:id="74"/>
+    <w:bookmarkStart w:id="76" w:name="ref-kuhnAppliedPredictiveModeling2018"/>
     <w:p>
       <w:pPr>
         <w:pStyle w:val="Bibliography"/>
@@ -5042,7 +5011,7 @@
       <w:r>
         <w:t xml:space="preserve"> </w:t>
       </w:r>
-      <w:hyperlink r:id="rId77">
+      <w:hyperlink r:id="rId75">
         <w:r>
           <w:rPr>
             <w:rStyle w:val="Hyperlink"/>
@@ -5054,8 +5023,8 @@
         <w:t xml:space="preserve">.</w:t>
       </w:r>
     </w:p>
-    <w:bookmarkEnd w:id="78"/>
-    <w:bookmarkStart w:id="79" w:name="ref-kuhnTidymodelsCollectionPackages2020"/>
+    <w:bookmarkEnd w:id="76"/>
+    <w:bookmarkStart w:id="77" w:name="ref-kuhnTidymodelsCollectionPackages2020"/>
     <w:p>
       <w:pPr>
         <w:pStyle w:val="Bibliography"/>
@@ -5070,8 +5039,8 @@
         <w:t xml:space="preserve">“Tidymodels: A Collection of Packages for Modeling and Machine Learning Using Tidyverse Principles.”</w:t>
       </w:r>
     </w:p>
-    <w:bookmarkEnd w:id="79"/>
-    <w:bookmarkStart w:id="81" w:name="ref-kullSigmoidsHowObtain2017"/>
+    <w:bookmarkEnd w:id="77"/>
+    <w:bookmarkStart w:id="79" w:name="ref-kullSigmoidsHowObtain2017"/>
     <w:p>
       <w:pPr>
         <w:pStyle w:val="Bibliography"/>
@@ -5116,7 +5085,7 @@
       <w:r>
         <w:t xml:space="preserve"> </w:t>
       </w:r>
-      <w:hyperlink r:id="rId80">
+      <w:hyperlink r:id="rId78">
         <w:r>
           <w:rPr>
             <w:rStyle w:val="Hyperlink"/>
@@ -5128,8 +5097,8 @@
         <w:t xml:space="preserve">.</w:t>
       </w:r>
     </w:p>
-    <w:bookmarkEnd w:id="81"/>
-    <w:bookmarkStart w:id="82" w:name="X34be55f2a2ff67a14e7206627bb93b426490c87"/>
+    <w:bookmarkEnd w:id="79"/>
+    <w:bookmarkStart w:id="80" w:name="X34be55f2a2ff67a14e7206627bb93b426490c87"/>
     <w:p>
       <w:pPr>
         <w:pStyle w:val="Bibliography"/>
@@ -5214,8 +5183,8 @@
         <w:t xml:space="preserve">’17. Red Hook, NY, USA: Curran Associates Inc.</w:t>
       </w:r>
     </w:p>
-    <w:bookmarkEnd w:id="82"/>
-    <w:bookmarkStart w:id="83" w:name="X0900e084d2d8751b94683f82b04534ea811d54e"/>
+    <w:bookmarkEnd w:id="80"/>
+    <w:bookmarkStart w:id="81" w:name="X0900e084d2d8751b94683f82b04534ea811d54e"/>
     <w:p>
       <w:pPr>
         <w:pStyle w:val="Bibliography"/>
@@ -5328,84 +5297,8 @@
         <w:t xml:space="preserve">. First edition. New York: The Guilford Press.</w:t>
       </w:r>
     </w:p>
-    <w:bookmarkEnd w:id="83"/>
-    <w:bookmarkStart w:id="85" w:name="ref-mohrPersonalSensingUnderstanding2017"/>
-    <w:p>
-      <w:pPr>
-        <w:pStyle w:val="Bibliography"/>
-      </w:pPr>
-      <w:r>
-        <w:t xml:space="preserve">Mohr, David C., Mi Zhang, and Stephen M. Schueller. 2017.</w:t>
-      </w:r>
-      <w:r>
-        <w:t xml:space="preserve"> </w:t>
-      </w:r>
-      <w:r>
-        <w:t xml:space="preserve">“Personal</w:t>
-      </w:r>
-      <w:r>
-        <w:t xml:space="preserve"> </w:t>
-      </w:r>
-      <w:r>
-        <w:t xml:space="preserve">Sensing</w:t>
-      </w:r>
-      <w:r>
-        <w:t xml:space="preserve">:</w:t>
-      </w:r>
-      <w:r>
-        <w:t xml:space="preserve"> </w:t>
-      </w:r>
-      <w:r>
-        <w:t xml:space="preserve">Understanding Mental Health Using Ubiquitous Sensors</w:t>
-      </w:r>
-      <w:r>
-        <w:t xml:space="preserve"> </w:t>
-      </w:r>
-      <w:r>
-        <w:t xml:space="preserve">and</w:t>
-      </w:r>
-      <w:r>
-        <w:t xml:space="preserve"> </w:t>
-      </w:r>
-      <w:r>
-        <w:t xml:space="preserve">Machine Learning</w:t>
-      </w:r>
-      <w:r>
-        <w:t xml:space="preserve">.”</w:t>
-      </w:r>
-      <w:r>
-        <w:t xml:space="preserve"> </w:t>
-      </w:r>
-      <w:r>
-        <w:rPr>
-          <w:i/>
-          <w:iCs/>
-        </w:rPr>
-        <w:t xml:space="preserve">Annual Review of Clinical Psychology</w:t>
-      </w:r>
-      <w:r>
-        <w:t xml:space="preserve"> </w:t>
-      </w:r>
-      <w:r>
-        <w:t xml:space="preserve">13 (1): 23–47.</w:t>
-      </w:r>
-      <w:r>
-        <w:t xml:space="preserve"> </w:t>
-      </w:r>
-      <w:hyperlink r:id="rId84">
-        <w:r>
-          <w:rPr>
-            <w:rStyle w:val="Hyperlink"/>
-          </w:rPr>
-          <w:t xml:space="preserve">https://doi.org/10.1146/annurev-clinpsy-032816-044949</w:t>
-        </w:r>
-      </w:hyperlink>
-      <w:r>
-        <w:t xml:space="preserve">.</w:t>
-      </w:r>
-    </w:p>
-    <w:bookmarkEnd w:id="85"/>
-    <w:bookmarkStart w:id="87" w:name="ref-olfsonHealthcareCoverageService2022"/>
+    <w:bookmarkEnd w:id="81"/>
+    <w:bookmarkStart w:id="83" w:name="ref-olfsonHealthcareCoverageService2022"/>
     <w:p>
       <w:pPr>
         <w:pStyle w:val="Bibliography"/>
@@ -5438,7 +5331,7 @@
       <w:r>
         <w:t xml:space="preserve"> </w:t>
       </w:r>
-      <w:hyperlink r:id="rId86">
+      <w:hyperlink r:id="rId82">
         <w:r>
           <w:rPr>
             <w:rStyle w:val="Hyperlink"/>
@@ -5450,8 +5343,8 @@
         <w:t xml:space="preserve">.</w:t>
       </w:r>
     </w:p>
-    <w:bookmarkEnd w:id="87"/>
-    <w:bookmarkStart w:id="89" w:name="ref-pinedoCurrentReexaminationRacial2019"/>
+    <w:bookmarkEnd w:id="83"/>
+    <w:bookmarkStart w:id="85" w:name="ref-pinedoCurrentReexaminationRacial2019"/>
     <w:p>
       <w:pPr>
         <w:pStyle w:val="Bibliography"/>
@@ -5496,7 +5389,7 @@
       <w:r>
         <w:t xml:space="preserve"> </w:t>
       </w:r>
-      <w:hyperlink r:id="rId88">
+      <w:hyperlink r:id="rId84">
         <w:r>
           <w:rPr>
             <w:rStyle w:val="Hyperlink"/>
@@ -5508,8 +5401,8 @@
         <w:t xml:space="preserve">.</w:t>
       </w:r>
     </w:p>
-    <w:bookmarkEnd w:id="89"/>
-    <w:bookmarkStart w:id="91" w:name="Xd4c1d027f60920f356af6131267e679804e946e"/>
+    <w:bookmarkEnd w:id="85"/>
+    <w:bookmarkStart w:id="87" w:name="Xd4c1d027f60920f356af6131267e679804e946e"/>
     <w:p>
       <w:pPr>
         <w:pStyle w:val="Bibliography"/>
@@ -5554,7 +5447,7 @@
       <w:r>
         <w:t xml:space="preserve"> </w:t>
       </w:r>
-      <w:hyperlink r:id="rId90">
+      <w:hyperlink r:id="rId86">
         <w:r>
           <w:rPr>
             <w:rStyle w:val="Hyperlink"/>
@@ -5566,8 +5459,8 @@
         <w:t xml:space="preserve">.</w:t>
       </w:r>
     </w:p>
-    <w:bookmarkEnd w:id="91"/>
-    <w:bookmarkStart w:id="93" w:name="ref-waltersUsingMachineLearning2021"/>
+    <w:bookmarkEnd w:id="87"/>
+    <w:bookmarkStart w:id="89" w:name="ref-waltersUsingMachineLearning2021"/>
     <w:p>
       <w:pPr>
         <w:pStyle w:val="Bibliography"/>
@@ -5600,7 +5493,7 @@
       <w:r>
         <w:t xml:space="preserve"> </w:t>
       </w:r>
-      <w:hyperlink r:id="rId92">
+      <w:hyperlink r:id="rId88">
         <w:r>
           <w:rPr>
             <w:rStyle w:val="Hyperlink"/>
@@ -5612,8 +5505,8 @@
         <w:t xml:space="preserve">.</w:t>
       </w:r>
     </w:p>
-    <w:bookmarkEnd w:id="93"/>
-    <w:bookmarkStart w:id="95" w:name="X4446e184b7dd55a61fd406499f32542fdcf24b5"/>
+    <w:bookmarkEnd w:id="89"/>
+    <w:bookmarkStart w:id="91" w:name="X4446e184b7dd55a61fd406499f32542fdcf24b5"/>
     <w:p>
       <w:pPr>
         <w:pStyle w:val="Bibliography"/>
@@ -5658,7 +5551,7 @@
       <w:r>
         <w:t xml:space="preserve"> </w:t>
       </w:r>
-      <w:hyperlink r:id="rId94">
+      <w:hyperlink r:id="rId90">
         <w:r>
           <w:rPr>
             <w:rStyle w:val="Hyperlink"/>
@@ -5670,8 +5563,105 @@
         <w:t xml:space="preserve">.</w:t>
       </w:r>
     </w:p>
-    <w:bookmarkEnd w:id="95"/>
-    <w:bookmarkStart w:id="97" w:name="Xb35ee182d565575e339a0170868456c1684f821"/>
+    <w:bookmarkEnd w:id="91"/>
+    <w:bookmarkStart w:id="93" w:name="X254a0f87701f835b5365990b3eba45be7dca59c"/>
+    <w:p>
+      <w:pPr>
+        <w:pStyle w:val="Bibliography"/>
+      </w:pPr>
+      <w:r>
+        <w:t xml:space="preserve">———. 2007.</w:t>
+      </w:r>
+      <w:r>
+        <w:t xml:space="preserve"> </w:t>
+      </w:r>
+      <w:r>
+        <w:t xml:space="preserve">“Modeling the Complexity of Post-Treatment Drinking:</w:t>
+      </w:r>
+      <w:r>
+        <w:t xml:space="preserve"> </w:t>
+      </w:r>
+      <w:r>
+        <w:t xml:space="preserve">It</w:t>
+      </w:r>
+      <w:r>
+        <w:t xml:space="preserve">’s a Rocky Road to Relapse.”</w:t>
+      </w:r>
+      <w:r>
+        <w:t xml:space="preserve"> </w:t>
+      </w:r>
+      <w:r>
+        <w:rPr>
+          <w:i/>
+          <w:iCs/>
+        </w:rPr>
+        <w:t xml:space="preserve">Clinical Psychology Review</w:t>
+      </w:r>
+      <w:r>
+        <w:t xml:space="preserve">, New</w:t>
+      </w:r>
+      <w:r>
+        <w:t xml:space="preserve"> </w:t>
+      </w:r>
+      <w:r>
+        <w:t xml:space="preserve">Approaches</w:t>
+      </w:r>
+      <w:r>
+        <w:t xml:space="preserve"> </w:t>
+      </w:r>
+      <w:r>
+        <w:t xml:space="preserve">to the</w:t>
+      </w:r>
+      <w:r>
+        <w:t xml:space="preserve"> </w:t>
+      </w:r>
+      <w:r>
+        <w:t xml:space="preserve">Study</w:t>
+      </w:r>
+      <w:r>
+        <w:t xml:space="preserve"> </w:t>
+      </w:r>
+      <w:r>
+        <w:t xml:space="preserve">of</w:t>
+      </w:r>
+      <w:r>
+        <w:t xml:space="preserve"> </w:t>
+      </w:r>
+      <w:r>
+        <w:t xml:space="preserve">Change</w:t>
+      </w:r>
+      <w:r>
+        <w:t xml:space="preserve"> </w:t>
+      </w:r>
+      <w:r>
+        <w:t xml:space="preserve">in</w:t>
+      </w:r>
+      <w:r>
+        <w:t xml:space="preserve"> </w:t>
+      </w:r>
+      <w:r>
+        <w:t xml:space="preserve">Cognitive Behavioral Therapies</w:t>
+      </w:r>
+      <w:r>
+        <w:t xml:space="preserve">, 27 (6): 724–38.</w:t>
+      </w:r>
+      <w:r>
+        <w:t xml:space="preserve"> </w:t>
+      </w:r>
+      <w:hyperlink r:id="rId92">
+        <w:r>
+          <w:rPr>
+            <w:rStyle w:val="Hyperlink"/>
+          </w:rPr>
+          <w:t xml:space="preserve">https://doi.org/10.1016/j.cpr.2007.01.002</w:t>
+        </w:r>
+      </w:hyperlink>
+      <w:r>
+        <w:t xml:space="preserve">.</w:t>
+      </w:r>
+    </w:p>
+    <w:bookmarkEnd w:id="93"/>
+    <w:bookmarkStart w:id="95" w:name="Xb35ee182d565575e339a0170868456c1684f821"/>
     <w:p>
       <w:pPr>
         <w:pStyle w:val="Bibliography"/>
@@ -5722,7 +5712,7 @@
       <w:r>
         <w:t xml:space="preserve"> </w:t>
       </w:r>
-      <w:hyperlink r:id="rId96">
+      <w:hyperlink r:id="rId94">
         <w:r>
           <w:rPr>
             <w:rStyle w:val="Hyperlink"/>
@@ -5734,8 +5724,8 @@
         <w:t xml:space="preserve">.</w:t>
       </w:r>
     </w:p>
-    <w:bookmarkEnd w:id="97"/>
-    <w:bookmarkStart w:id="99" w:name="ref-wyantMachineLearningModels2023"/>
+    <w:bookmarkEnd w:id="95"/>
+    <w:bookmarkStart w:id="97" w:name="ref-wyantMachineLearningModels2023"/>
     <w:p>
       <w:pPr>
         <w:pStyle w:val="Bibliography"/>
@@ -5765,7 +5755,7 @@
       <w:r>
         <w:t xml:space="preserve"> </w:t>
       </w:r>
-      <w:hyperlink r:id="rId98">
+      <w:hyperlink r:id="rId96">
         <w:r>
           <w:rPr>
             <w:rStyle w:val="Hyperlink"/>
@@ -5777,10 +5767,10 @@
         <w:t xml:space="preserve">.</w:t>
       </w:r>
     </w:p>
+    <w:bookmarkEnd w:id="97"/>
+    <w:bookmarkEnd w:id="98"/>
     <w:bookmarkEnd w:id="99"/>
     <w:bookmarkEnd w:id="100"/>
-    <w:bookmarkEnd w:id="101"/>
-    <w:bookmarkEnd w:id="102"/>
     <w:sectPr/>
   </w:body>
 </w:document>

</xml_diff>

<commit_message>
manuscript updates for JC review
</commit_message>
<xml_diff>
--- a/docs/index.docx
+++ b/docs/index.docx
@@ -373,7 +373,7 @@
         <w:t xml:space="preserve"> </w:t>
       </w:r>
       <w:r>
-        <w:t xml:space="preserve">do we best treat a specific individual (e.g., which medication will work best for an individual given their unique background, preferences, and medical history).</w:t>
+        <w:t xml:space="preserve">do we best treat a specific individual (e.g., which medication will work best for an individual given their unique background, preferences, and medical history)?</w:t>
       </w:r>
     </w:p>
     <w:p>
@@ -381,10 +381,7 @@
         <w:pStyle w:val="BodyText"/>
       </w:pPr>
       <w:r>
-        <w:t xml:space="preserve">Today, this approach is also applied to chronic mental health conditions (i.e., precision mental health), like depression, substance use disorders, and suicide [</w:t>
-      </w:r>
-      <w:r>
-        <w:t xml:space="preserve">]. However, mental health conditions are complex fluctuating processes. Unlike medical conditions that have clear biological precursors, mental health conditions are products of lots of psychosocial factors. These factors differ between individuals and within an individual over time. Additionally, there are a wide array of psychosocial supports available for clinicians to select from. Thus, precision mental health must consider both the</w:t>
+        <w:t xml:space="preserve">Today, this approach is also applied to chronic mental health conditions (i.e., precision mental health), like depression, substance use disorders, and suicide. However, mental health conditions are complex fluctuating processes. Unlike medical conditions that have clear biological precursors, mental health conditions are products of lots of psychosocial factors. These factors differ between individuals and within an individual over time. Additionally, there are a wide array of psychosocial supports available for clinicians to select from. Thus, precision mental health must consider both the</w:t>
       </w:r>
       <w:r>
         <w:t xml:space="preserve"> </w:t>
@@ -447,7 +444,7 @@
         <w:pStyle w:val="BodyText"/>
       </w:pPr>
       <w:r>
-        <w:t xml:space="preserve">Take the example of lapses, discrete instances of goal inconsistent substance use. Lapses are a clinically important target for substance use treatment. They are often an early warning sign of relapse, maladaptive responses to lapses can undermine recovery, and for some substances a single lapse can result in an overdose and/or death. It would be unreasonable to expect that we could predict a lapse with any temporal precision using only features that become more distal as time progresses. Lapse prediction requires dense, long-term monitoring of symptoms and related states proximal to the outcome.</w:t>
+        <w:t xml:space="preserve">Take the example of lapses, discrete instances of goal inconsistent substance use. Lapses are a clinically important target for substance use treatment. They are often an early warning sign of relapse, maladaptive responses to lapses can undermine recovery, and for some substances a single lapse can result in an overdose and/or death. It would be unreasonable to expect that we could predict a lapse with any temporal precision using only features that become more distal as time progresses. On the contrary, lapse prediction requires dense, long-term monitoring of symptoms and related states proximal to the outcome.</w:t>
       </w:r>
     </w:p>
     <w:p>
@@ -543,7 +540,7 @@
       </w:r>
     </w:p>
     <w:bookmarkEnd w:id="21"/>
-    <w:bookmarkStart w:id="101" w:name="methods"/>
+    <w:bookmarkStart w:id="100" w:name="methods"/>
     <w:p>
       <w:pPr>
         <w:pStyle w:val="Heading1"/>
@@ -759,7 +756,7 @@
     </w:p>
     <w:bookmarkEnd w:id="27"/>
     <w:bookmarkEnd w:id="28"/>
-    <w:bookmarkStart w:id="38" w:name="data-analytic-strategy"/>
+    <w:bookmarkStart w:id="39" w:name="data-analytic-strategy"/>
     <w:p>
       <w:pPr>
         <w:pStyle w:val="Heading2"/>
@@ -959,7 +956,7 @@
       </w:r>
     </w:p>
     <w:bookmarkEnd w:id="30"/>
-    <w:bookmarkStart w:id="37" w:name="model-training-and-evaluation"/>
+    <w:bookmarkStart w:id="38" w:name="model-training-and-evaluation"/>
     <w:p>
       <w:pPr>
         <w:pStyle w:val="Heading3"/>
@@ -1114,7 +1111,7 @@
       </w:r>
     </w:p>
     <w:bookmarkEnd w:id="34"/>
-    <w:bookmarkStart w:id="35" w:name="fairness-benchmarks"/>
+    <w:bookmarkStart w:id="36" w:name="fairness-benchmarks"/>
     <w:p>
       <w:pPr>
         <w:pStyle w:val="Heading4"/>
@@ -1137,7 +1134,7 @@
         <w:t xml:space="preserve">(Pinedo 2019; Kilaru et al. 2020)</w:t>
       </w:r>
       <w:r>
-        <w:t xml:space="preserve">, income (above poverty vs. at or below poverty)</w:t>
+        <w:t xml:space="preserve">, income (above poverty vs. below poverty)</w:t>
       </w:r>
       <w:r>
         <w:t xml:space="preserve"> </w:t>
@@ -1163,14 +1160,17 @@
         <w:pStyle w:val="BodyText"/>
       </w:pPr>
       <w:r>
-        <w:t xml:space="preserve">We also acknowledge that models that work for only a subset of people, if implemented, could widen existing treatment disparities. We conducted Bayesian group comparisons to assess the likelihood that the model performs differently by group. We report median differences in posterior probabilities and the 95% Bayesian CIs.</w:t>
-      </w:r>
-      <w:r>
-        <w:t xml:space="preserve"> </w:t>
-      </w:r>
-    </w:p>
-    <w:bookmarkEnd w:id="35"/>
-    <w:bookmarkStart w:id="36" w:name="feature-importance"/>
+        <w:t xml:space="preserve">We also acknowledge that models that work for only a subset of people, if implemented, could widen existing treatment disparities. We conducted Bayesian group comparisons to assess the likelihood that the model performs differently by group. We report median differences in posterior probabilities and the range.</w:t>
+      </w:r>
+      <w:r>
+        <w:rPr>
+          <w:rStyle w:val="FootnoteReference"/>
+        </w:rPr>
+        <w:footnoteReference w:id="35"/>
+      </w:r>
+    </w:p>
+    <w:bookmarkEnd w:id="36"/>
+    <w:bookmarkStart w:id="37" w:name="feature-importance"/>
     <w:p>
       <w:pPr>
         <w:pStyle w:val="Heading4"/>
@@ -1199,10 +1199,10 @@
         <w:t xml:space="preserve">from the 30 test sets to provide a description of the importance of categories of features across our five models. We used the SHAPforxgboost package that provides Shapley values in log-odds units for binary classification models. We averaged the three Shapley values for each observation for each feature (i.e., across the three repeats) to increase their stability. An inherent property of Shapley values is their additivity, allowing us to combine features into feature categories. We created separate feature categories for each of the nine EMA questions, the rates of past alcohol use and missing surveys, the time of day and day of the week of the start of the prediction window, and the seven demographic variables included in the models. We calculated the local (i.e., for each observation) importance for each category of features by adding Shapley values across all features in a category, separately for each observation. We calculated global importance for each feature category by averaging the absolute value of the Shapley values of all features in the category across all observations. These local and global importance scores based on Shapley values allow us to contextualize relative feature importance.</w:t>
       </w:r>
     </w:p>
-    <w:bookmarkEnd w:id="36"/>
     <w:bookmarkEnd w:id="37"/>
     <w:bookmarkEnd w:id="38"/>
-    <w:bookmarkStart w:id="60" w:name="results"/>
+    <w:bookmarkEnd w:id="39"/>
+    <w:bookmarkStart w:id="59" w:name="results"/>
     <w:p>
       <w:pPr>
         <w:pStyle w:val="Heading2"/>
@@ -1211,7 +1211,7 @@
         <w:t xml:space="preserve">Results</w:t>
       </w:r>
     </w:p>
-    <w:bookmarkStart w:id="43" w:name="demographic-and-lapse-characteristics"/>
+    <w:bookmarkStart w:id="42" w:name="demographic-and-lapse-characteristics"/>
     <w:p>
       <w:pPr>
         <w:pStyle w:val="Heading3"/>
@@ -1250,7 +1250,7 @@
       <w:r>
         <w:t xml:space="preserve"> </w:t>
       </w:r>
-      <w:hyperlink w:anchor="tbl-demopdf">
+      <w:hyperlink w:anchor="tbl-demohtml">
         <w:r>
           <w:rPr>
             <w:rStyle w:val="Hyperlink"/>
@@ -1278,7 +1278,7 @@
       <w:tr>
         <w:tc>
           <w:tcPr/>
-          <w:bookmarkStart w:id="39" w:name="tbl-demopdf"/>
+          <w:bookmarkStart w:id="40" w:name="tbl-demohtml"/>
           <w:p>
             <w:pPr>
               <w:jc w:val="center"/>
@@ -3491,8 +3491,599 @@
                 </w:p>
               </w:tc>
             </w:tr>
+            <w:tr>
+              <w:tc>
+                <w:tcPr/>
+                <w:p>
+                  <w:pPr>
+                    <w:pStyle w:val="Compact"/>
+                    <w:jc w:val="left"/>
+                    <w:jc w:val="center"/>
+                  </w:pPr>
+                  <w:r>
+                    <w:t xml:space="preserve">Married</w:t>
+                  </w:r>
+                </w:p>
+              </w:tc>
+              <w:tc>
+                <w:tcPr/>
+                <w:p>
+                  <w:pPr>
+                    <w:pStyle w:val="Compact"/>
+                    <w:jc w:val="right"/>
+                    <w:jc w:val="center"/>
+                  </w:pPr>
+                  <w:r>
+                    <w:t xml:space="preserve">32</w:t>
+                  </w:r>
+                </w:p>
+              </w:tc>
+              <w:tc>
+                <w:tcPr/>
+                <w:p>
+                  <w:pPr>
+                    <w:pStyle w:val="Compact"/>
+                    <w:jc w:val="right"/>
+                    <w:jc w:val="center"/>
+                  </w:pPr>
+                  <w:r>
+                    <w:t xml:space="preserve">21.2</w:t>
+                  </w:r>
+                </w:p>
+              </w:tc>
+              <w:tc>
+                <w:tcPr/>
+                <w:p>
+                  <w:pPr>
+                    <w:pStyle w:val="Compact"/>
+                  </w:pPr>
+                </w:p>
+              </w:tc>
+              <w:tc>
+                <w:tcPr/>
+                <w:p>
+                  <w:pPr>
+                    <w:pStyle w:val="Compact"/>
+                  </w:pPr>
+                </w:p>
+              </w:tc>
+              <w:tc>
+                <w:tcPr/>
+                <w:p>
+                  <w:pPr>
+                    <w:pStyle w:val="Compact"/>
+                  </w:pPr>
+                </w:p>
+              </w:tc>
+            </w:tr>
+            <w:tr>
+              <w:tc>
+                <w:tcPr/>
+                <w:p>
+                  <w:pPr>
+                    <w:pStyle w:val="Compact"/>
+                    <w:jc w:val="left"/>
+                    <w:jc w:val="center"/>
+                  </w:pPr>
+                  <w:r>
+                    <w:t xml:space="preserve">Divorced</w:t>
+                  </w:r>
+                </w:p>
+              </w:tc>
+              <w:tc>
+                <w:tcPr/>
+                <w:p>
+                  <w:pPr>
+                    <w:pStyle w:val="Compact"/>
+                    <w:jc w:val="right"/>
+                    <w:jc w:val="center"/>
+                  </w:pPr>
+                  <w:r>
+                    <w:t xml:space="preserve">45</w:t>
+                  </w:r>
+                </w:p>
+              </w:tc>
+              <w:tc>
+                <w:tcPr/>
+                <w:p>
+                  <w:pPr>
+                    <w:pStyle w:val="Compact"/>
+                    <w:jc w:val="right"/>
+                    <w:jc w:val="center"/>
+                  </w:pPr>
+                  <w:r>
+                    <w:t xml:space="preserve">29.8</w:t>
+                  </w:r>
+                </w:p>
+              </w:tc>
+              <w:tc>
+                <w:tcPr/>
+                <w:p>
+                  <w:pPr>
+                    <w:pStyle w:val="Compact"/>
+                  </w:pPr>
+                </w:p>
+              </w:tc>
+              <w:tc>
+                <w:tcPr/>
+                <w:p>
+                  <w:pPr>
+                    <w:pStyle w:val="Compact"/>
+                  </w:pPr>
+                </w:p>
+              </w:tc>
+              <w:tc>
+                <w:tcPr/>
+                <w:p>
+                  <w:pPr>
+                    <w:pStyle w:val="Compact"/>
+                  </w:pPr>
+                </w:p>
+              </w:tc>
+            </w:tr>
+            <w:tr>
+              <w:tc>
+                <w:tcPr/>
+                <w:p>
+                  <w:pPr>
+                    <w:pStyle w:val="Compact"/>
+                    <w:jc w:val="left"/>
+                    <w:jc w:val="center"/>
+                  </w:pPr>
+                  <w:r>
+                    <w:t xml:space="preserve">Separated</w:t>
+                  </w:r>
+                </w:p>
+              </w:tc>
+              <w:tc>
+                <w:tcPr/>
+                <w:p>
+                  <w:pPr>
+                    <w:pStyle w:val="Compact"/>
+                    <w:jc w:val="right"/>
+                    <w:jc w:val="center"/>
+                  </w:pPr>
+                  <w:r>
+                    <w:t xml:space="preserve">5</w:t>
+                  </w:r>
+                </w:p>
+              </w:tc>
+              <w:tc>
+                <w:tcPr/>
+                <w:p>
+                  <w:pPr>
+                    <w:pStyle w:val="Compact"/>
+                    <w:jc w:val="right"/>
+                    <w:jc w:val="center"/>
+                  </w:pPr>
+                  <w:r>
+                    <w:t xml:space="preserve">3.3</w:t>
+                  </w:r>
+                </w:p>
+              </w:tc>
+              <w:tc>
+                <w:tcPr/>
+                <w:p>
+                  <w:pPr>
+                    <w:pStyle w:val="Compact"/>
+                  </w:pPr>
+                </w:p>
+              </w:tc>
+              <w:tc>
+                <w:tcPr/>
+                <w:p>
+                  <w:pPr>
+                    <w:pStyle w:val="Compact"/>
+                  </w:pPr>
+                </w:p>
+              </w:tc>
+              <w:tc>
+                <w:tcPr/>
+                <w:p>
+                  <w:pPr>
+                    <w:pStyle w:val="Compact"/>
+                  </w:pPr>
+                </w:p>
+              </w:tc>
+            </w:tr>
+            <w:tr>
+              <w:tc>
+                <w:tcPr/>
+                <w:p>
+                  <w:pPr>
+                    <w:pStyle w:val="Compact"/>
+                    <w:jc w:val="left"/>
+                    <w:jc w:val="center"/>
+                  </w:pPr>
+                  <w:r>
+                    <w:t xml:space="preserve">Widowed</w:t>
+                  </w:r>
+                </w:p>
+              </w:tc>
+              <w:tc>
+                <w:tcPr/>
+                <w:p>
+                  <w:pPr>
+                    <w:pStyle w:val="Compact"/>
+                    <w:jc w:val="right"/>
+                    <w:jc w:val="center"/>
+                  </w:pPr>
+                  <w:r>
+                    <w:t xml:space="preserve">2</w:t>
+                  </w:r>
+                </w:p>
+              </w:tc>
+              <w:tc>
+                <w:tcPr/>
+                <w:p>
+                  <w:pPr>
+                    <w:pStyle w:val="Compact"/>
+                    <w:jc w:val="right"/>
+                    <w:jc w:val="center"/>
+                  </w:pPr>
+                  <w:r>
+                    <w:t xml:space="preserve">1.3</w:t>
+                  </w:r>
+                </w:p>
+              </w:tc>
+              <w:tc>
+                <w:tcPr/>
+                <w:p>
+                  <w:pPr>
+                    <w:pStyle w:val="Compact"/>
+                  </w:pPr>
+                </w:p>
+              </w:tc>
+              <w:tc>
+                <w:tcPr/>
+                <w:p>
+                  <w:pPr>
+                    <w:pStyle w:val="Compact"/>
+                  </w:pPr>
+                </w:p>
+              </w:tc>
+              <w:tc>
+                <w:tcPr/>
+                <w:p>
+                  <w:pPr>
+                    <w:pStyle w:val="Compact"/>
+                  </w:pPr>
+                </w:p>
+              </w:tc>
+            </w:tr>
+            <w:tr>
+              <w:tc>
+                <w:tcPr/>
+                <w:p>
+                  <w:pPr>
+                    <w:pStyle w:val="Compact"/>
+                    <w:jc w:val="left"/>
+                    <w:jc w:val="center"/>
+                  </w:pPr>
+                  <w:r>
+                    <w:t xml:space="preserve">DSM-5 AUD Symptom Count</w:t>
+                  </w:r>
+                </w:p>
+              </w:tc>
+              <w:tc>
+                <w:tcPr/>
+                <w:p>
+                  <w:pPr>
+                    <w:pStyle w:val="Compact"/>
+                  </w:pPr>
+                </w:p>
+              </w:tc>
+              <w:tc>
+                <w:tcPr/>
+                <w:p>
+                  <w:pPr>
+                    <w:pStyle w:val="Compact"/>
+                  </w:pPr>
+                </w:p>
+              </w:tc>
+              <w:tc>
+                <w:tcPr/>
+                <w:p>
+                  <w:pPr>
+                    <w:pStyle w:val="Compact"/>
+                    <w:jc w:val="left"/>
+                    <w:jc w:val="center"/>
+                  </w:pPr>
+                  <w:r>
+                    <w:t xml:space="preserve">8.9</w:t>
+                  </w:r>
+                </w:p>
+              </w:tc>
+              <w:tc>
+                <w:tcPr/>
+                <w:p>
+                  <w:pPr>
+                    <w:pStyle w:val="Compact"/>
+                    <w:jc w:val="left"/>
+                    <w:jc w:val="center"/>
+                  </w:pPr>
+                  <w:r>
+                    <w:t xml:space="preserve">1.9</w:t>
+                  </w:r>
+                </w:p>
+              </w:tc>
+              <w:tc>
+                <w:tcPr/>
+                <w:p>
+                  <w:pPr>
+                    <w:pStyle w:val="Compact"/>
+                    <w:jc w:val="left"/>
+                    <w:jc w:val="center"/>
+                  </w:pPr>
+                  <w:r>
+                    <w:t xml:space="preserve">4-11</w:t>
+                  </w:r>
+                </w:p>
+              </w:tc>
+            </w:tr>
+            <w:tr>
+              <w:tc>
+                <w:tcPr/>
+                <w:p>
+                  <w:pPr>
+                    <w:pStyle w:val="Compact"/>
+                    <w:jc w:val="left"/>
+                    <w:jc w:val="center"/>
+                  </w:pPr>
+                  <w:r>
+                    <w:t xml:space="preserve">Reported 1 or More Lapse During Study</w:t>
+                  </w:r>
+                  <w:r>
+                    <w:t xml:space="preserve"> </w:t>
+                  </w:r>
+                  <w:r>
+                    <w:t xml:space="preserve">Period</w:t>
+                  </w:r>
+                </w:p>
+              </w:tc>
+              <w:tc>
+                <w:tcPr/>
+                <w:p>
+                  <w:pPr>
+                    <w:pStyle w:val="Compact"/>
+                  </w:pPr>
+                </w:p>
+              </w:tc>
+              <w:tc>
+                <w:tcPr/>
+                <w:p>
+                  <w:pPr>
+                    <w:pStyle w:val="Compact"/>
+                  </w:pPr>
+                </w:p>
+              </w:tc>
+              <w:tc>
+                <w:tcPr/>
+                <w:p>
+                  <w:pPr>
+                    <w:pStyle w:val="Compact"/>
+                  </w:pPr>
+                </w:p>
+              </w:tc>
+              <w:tc>
+                <w:tcPr/>
+                <w:p>
+                  <w:pPr>
+                    <w:pStyle w:val="Compact"/>
+                  </w:pPr>
+                </w:p>
+              </w:tc>
+              <w:tc>
+                <w:tcPr/>
+                <w:p>
+                  <w:pPr>
+                    <w:pStyle w:val="Compact"/>
+                  </w:pPr>
+                </w:p>
+              </w:tc>
+            </w:tr>
+            <w:tr>
+              <w:tc>
+                <w:tcPr/>
+                <w:p>
+                  <w:pPr>
+                    <w:pStyle w:val="Compact"/>
+                    <w:jc w:val="left"/>
+                    <w:jc w:val="center"/>
+                  </w:pPr>
+                  <w:r>
+                    <w:t xml:space="preserve">Yes</w:t>
+                  </w:r>
+                </w:p>
+              </w:tc>
+              <w:tc>
+                <w:tcPr/>
+                <w:p>
+                  <w:pPr>
+                    <w:pStyle w:val="Compact"/>
+                    <w:jc w:val="right"/>
+                    <w:jc w:val="center"/>
+                  </w:pPr>
+                  <w:r>
+                    <w:t xml:space="preserve">84</w:t>
+                  </w:r>
+                </w:p>
+              </w:tc>
+              <w:tc>
+                <w:tcPr/>
+                <w:p>
+                  <w:pPr>
+                    <w:pStyle w:val="Compact"/>
+                    <w:jc w:val="right"/>
+                    <w:jc w:val="center"/>
+                  </w:pPr>
+                  <w:r>
+                    <w:t xml:space="preserve">55.6</w:t>
+                  </w:r>
+                </w:p>
+              </w:tc>
+              <w:tc>
+                <w:tcPr/>
+                <w:p>
+                  <w:pPr>
+                    <w:pStyle w:val="Compact"/>
+                  </w:pPr>
+                </w:p>
+              </w:tc>
+              <w:tc>
+                <w:tcPr/>
+                <w:p>
+                  <w:pPr>
+                    <w:pStyle w:val="Compact"/>
+                  </w:pPr>
+                </w:p>
+              </w:tc>
+              <w:tc>
+                <w:tcPr/>
+                <w:p>
+                  <w:pPr>
+                    <w:pStyle w:val="Compact"/>
+                  </w:pPr>
+                </w:p>
+              </w:tc>
+            </w:tr>
+            <w:tr>
+              <w:tc>
+                <w:tcPr/>
+                <w:p>
+                  <w:pPr>
+                    <w:pStyle w:val="Compact"/>
+                    <w:jc w:val="left"/>
+                    <w:jc w:val="center"/>
+                  </w:pPr>
+                  <w:r>
+                    <w:t xml:space="preserve">No</w:t>
+                  </w:r>
+                </w:p>
+              </w:tc>
+              <w:tc>
+                <w:tcPr/>
+                <w:p>
+                  <w:pPr>
+                    <w:pStyle w:val="Compact"/>
+                    <w:jc w:val="right"/>
+                    <w:jc w:val="center"/>
+                  </w:pPr>
+                  <w:r>
+                    <w:t xml:space="preserve">67</w:t>
+                  </w:r>
+                </w:p>
+              </w:tc>
+              <w:tc>
+                <w:tcPr/>
+                <w:p>
+                  <w:pPr>
+                    <w:pStyle w:val="Compact"/>
+                    <w:jc w:val="right"/>
+                    <w:jc w:val="center"/>
+                  </w:pPr>
+                  <w:r>
+                    <w:t xml:space="preserve">44.4</w:t>
+                  </w:r>
+                </w:p>
+              </w:tc>
+              <w:tc>
+                <w:tcPr/>
+                <w:p>
+                  <w:pPr>
+                    <w:pStyle w:val="Compact"/>
+                  </w:pPr>
+                </w:p>
+              </w:tc>
+              <w:tc>
+                <w:tcPr/>
+                <w:p>
+                  <w:pPr>
+                    <w:pStyle w:val="Compact"/>
+                  </w:pPr>
+                </w:p>
+              </w:tc>
+              <w:tc>
+                <w:tcPr/>
+                <w:p>
+                  <w:pPr>
+                    <w:pStyle w:val="Compact"/>
+                  </w:pPr>
+                </w:p>
+              </w:tc>
+            </w:tr>
+            <w:tr>
+              <w:tc>
+                <w:tcPr/>
+                <w:p>
+                  <w:pPr>
+                    <w:pStyle w:val="Compact"/>
+                    <w:jc w:val="left"/>
+                    <w:jc w:val="center"/>
+                  </w:pPr>
+                  <w:r>
+                    <w:t xml:space="preserve">Number of reported lapses</w:t>
+                  </w:r>
+                </w:p>
+              </w:tc>
+              <w:tc>
+                <w:tcPr/>
+                <w:p>
+                  <w:pPr>
+                    <w:pStyle w:val="Compact"/>
+                  </w:pPr>
+                </w:p>
+              </w:tc>
+              <w:tc>
+                <w:tcPr/>
+                <w:p>
+                  <w:pPr>
+                    <w:pStyle w:val="Compact"/>
+                  </w:pPr>
+                </w:p>
+              </w:tc>
+              <w:tc>
+                <w:tcPr/>
+                <w:p>
+                  <w:pPr>
+                    <w:pStyle w:val="Compact"/>
+                    <w:jc w:val="left"/>
+                    <w:jc w:val="center"/>
+                  </w:pPr>
+                  <w:r>
+                    <w:t xml:space="preserve">6.8</w:t>
+                  </w:r>
+                </w:p>
+              </w:tc>
+              <w:tc>
+                <w:tcPr/>
+                <w:p>
+                  <w:pPr>
+                    <w:pStyle w:val="Compact"/>
+                    <w:jc w:val="left"/>
+                    <w:jc w:val="center"/>
+                  </w:pPr>
+                  <w:r>
+                    <w:t xml:space="preserve">12</w:t>
+                  </w:r>
+                </w:p>
+              </w:tc>
+              <w:tc>
+                <w:tcPr/>
+                <w:p>
+                  <w:pPr>
+                    <w:pStyle w:val="Compact"/>
+                    <w:jc w:val="left"/>
+                    <w:jc w:val="center"/>
+                  </w:pPr>
+                  <w:r>
+                    <w:t xml:space="preserve">0-75</w:t>
+                  </w:r>
+                </w:p>
+              </w:tc>
+            </w:tr>
           </w:tbl>
-          <w:bookmarkEnd w:id="39"/>
+          <w:bookmarkEnd w:id="40"/>
           <w:p/>
         </w:tc>
       </w:tr>
@@ -3513,7 +4104,7 @@
         </w:rPr>
         <w:t xml:space="preserve"> </w:t>
       </w:r>
-      <w:hyperlink r:id="rId40">
+      <w:hyperlink r:id="rId41">
         <w:r>
           <w:rPr>
             <w:rStyle w:val="Hyperlink"/>
@@ -3523,700 +4114,8 @@
         </w:r>
       </w:hyperlink>
     </w:p>
-    <w:p>
-      <w:r>
-        <w:br w:type="page"/>
-      </w:r>
-    </w:p>
-    <w:p>
-      <w:pPr>
-        <w:pStyle w:val="BodyText"/>
-      </w:pPr>
-      <w:r>
-        <w:t xml:space="preserve">Table 2: Demographic and Lapse Characteristics (Continued)</w:t>
-      </w:r>
-    </w:p>
-    <w:bookmarkStart w:id="41" w:name="demopdf"/>
-    <w:tbl>
-      <w:tblPr>
-        <w:tblStyle w:val="Table"/>
-        <w:tblW w:type="pct" w:w="4878"/>
-        <w:tblLayout w:type="fixed"/>
-        <w:tblLook w:firstRow="1" w:lastRow="0" w:firstColumn="0" w:lastColumn="0" w:noHBand="0" w:noVBand="0" w:val="0020"/>
-      </w:tblPr>
-      <w:tblGrid>
-        <w:gridCol w:w="4636"/>
-        <w:gridCol w:w="482"/>
-        <w:gridCol w:w="676"/>
-        <w:gridCol w:w="579"/>
-        <w:gridCol w:w="579"/>
-        <w:gridCol w:w="772"/>
-      </w:tblGrid>
-      <w:tr>
-        <w:trPr>
-          <w:tblHeader w:val="on"/>
-        </w:trPr>
-        <w:tc>
-          <w:tcPr/>
-          <w:p>
-            <w:pPr>
-              <w:pStyle w:val="Compact"/>
-              <w:jc w:val="left"/>
-            </w:pPr>
-            <w:r>
-              <w:t xml:space="preserve">var</w:t>
-            </w:r>
-          </w:p>
-        </w:tc>
-        <w:tc>
-          <w:tcPr/>
-          <w:p>
-            <w:pPr>
-              <w:pStyle w:val="Compact"/>
-              <w:jc w:val="right"/>
-            </w:pPr>
-            <w:r>
-              <w:t xml:space="preserve">N</w:t>
-            </w:r>
-          </w:p>
-        </w:tc>
-        <w:tc>
-          <w:tcPr/>
-          <w:p>
-            <w:pPr>
-              <w:pStyle w:val="Compact"/>
-              <w:jc w:val="right"/>
-            </w:pPr>
-            <w:r>
-              <w:t xml:space="preserve">%</w:t>
-            </w:r>
-          </w:p>
-        </w:tc>
-        <w:tc>
-          <w:tcPr/>
-          <w:p>
-            <w:pPr>
-              <w:pStyle w:val="Compact"/>
-              <w:jc w:val="left"/>
-            </w:pPr>
-            <w:r>
-              <w:t xml:space="preserve">M</w:t>
-            </w:r>
-          </w:p>
-        </w:tc>
-        <w:tc>
-          <w:tcPr/>
-          <w:p>
-            <w:pPr>
-              <w:pStyle w:val="Compact"/>
-              <w:jc w:val="left"/>
-            </w:pPr>
-            <w:r>
-              <w:t xml:space="preserve">SD</w:t>
-            </w:r>
-          </w:p>
-        </w:tc>
-        <w:tc>
-          <w:tcPr/>
-          <w:p>
-            <w:pPr>
-              <w:pStyle w:val="Compact"/>
-              <w:jc w:val="left"/>
-            </w:pPr>
-            <w:r>
-              <w:t xml:space="preserve">Range</w:t>
-            </w:r>
-          </w:p>
-        </w:tc>
-      </w:tr>
-      <w:tr>
-        <w:tc>
-          <w:tcPr/>
-          <w:p>
-            <w:pPr>
-              <w:pStyle w:val="Compact"/>
-              <w:jc w:val="left"/>
-            </w:pPr>
-            <w:r>
-              <w:t xml:space="preserve">Married</w:t>
-            </w:r>
-          </w:p>
-        </w:tc>
-        <w:tc>
-          <w:tcPr/>
-          <w:p>
-            <w:pPr>
-              <w:pStyle w:val="Compact"/>
-              <w:jc w:val="right"/>
-            </w:pPr>
-            <w:r>
-              <w:t xml:space="preserve">32</w:t>
-            </w:r>
-          </w:p>
-        </w:tc>
-        <w:tc>
-          <w:tcPr/>
-          <w:p>
-            <w:pPr>
-              <w:pStyle w:val="Compact"/>
-              <w:jc w:val="right"/>
-            </w:pPr>
-            <w:r>
-              <w:t xml:space="preserve">21.2</w:t>
-            </w:r>
-          </w:p>
-        </w:tc>
-        <w:tc>
-          <w:tcPr/>
-          <w:p>
-            <w:pPr>
-              <w:pStyle w:val="Compact"/>
-            </w:pPr>
-          </w:p>
-        </w:tc>
-        <w:tc>
-          <w:tcPr/>
-          <w:p>
-            <w:pPr>
-              <w:pStyle w:val="Compact"/>
-            </w:pPr>
-          </w:p>
-        </w:tc>
-        <w:tc>
-          <w:tcPr/>
-          <w:p>
-            <w:pPr>
-              <w:pStyle w:val="Compact"/>
-            </w:pPr>
-          </w:p>
-        </w:tc>
-      </w:tr>
-      <w:tr>
-        <w:tc>
-          <w:tcPr/>
-          <w:p>
-            <w:pPr>
-              <w:pStyle w:val="Compact"/>
-              <w:jc w:val="left"/>
-            </w:pPr>
-            <w:r>
-              <w:t xml:space="preserve">Divorced</w:t>
-            </w:r>
-          </w:p>
-        </w:tc>
-        <w:tc>
-          <w:tcPr/>
-          <w:p>
-            <w:pPr>
-              <w:pStyle w:val="Compact"/>
-              <w:jc w:val="right"/>
-            </w:pPr>
-            <w:r>
-              <w:t xml:space="preserve">45</w:t>
-            </w:r>
-          </w:p>
-        </w:tc>
-        <w:tc>
-          <w:tcPr/>
-          <w:p>
-            <w:pPr>
-              <w:pStyle w:val="Compact"/>
-              <w:jc w:val="right"/>
-            </w:pPr>
-            <w:r>
-              <w:t xml:space="preserve">29.8</w:t>
-            </w:r>
-          </w:p>
-        </w:tc>
-        <w:tc>
-          <w:tcPr/>
-          <w:p>
-            <w:pPr>
-              <w:pStyle w:val="Compact"/>
-            </w:pPr>
-          </w:p>
-        </w:tc>
-        <w:tc>
-          <w:tcPr/>
-          <w:p>
-            <w:pPr>
-              <w:pStyle w:val="Compact"/>
-            </w:pPr>
-          </w:p>
-        </w:tc>
-        <w:tc>
-          <w:tcPr/>
-          <w:p>
-            <w:pPr>
-              <w:pStyle w:val="Compact"/>
-            </w:pPr>
-          </w:p>
-        </w:tc>
-      </w:tr>
-      <w:tr>
-        <w:tc>
-          <w:tcPr/>
-          <w:p>
-            <w:pPr>
-              <w:pStyle w:val="Compact"/>
-              <w:jc w:val="left"/>
-            </w:pPr>
-            <w:r>
-              <w:t xml:space="preserve">Separated</w:t>
-            </w:r>
-          </w:p>
-        </w:tc>
-        <w:tc>
-          <w:tcPr/>
-          <w:p>
-            <w:pPr>
-              <w:pStyle w:val="Compact"/>
-              <w:jc w:val="right"/>
-            </w:pPr>
-            <w:r>
-              <w:t xml:space="preserve">5</w:t>
-            </w:r>
-          </w:p>
-        </w:tc>
-        <w:tc>
-          <w:tcPr/>
-          <w:p>
-            <w:pPr>
-              <w:pStyle w:val="Compact"/>
-              <w:jc w:val="right"/>
-            </w:pPr>
-            <w:r>
-              <w:t xml:space="preserve">3.3</w:t>
-            </w:r>
-          </w:p>
-        </w:tc>
-        <w:tc>
-          <w:tcPr/>
-          <w:p>
-            <w:pPr>
-              <w:pStyle w:val="Compact"/>
-            </w:pPr>
-          </w:p>
-        </w:tc>
-        <w:tc>
-          <w:tcPr/>
-          <w:p>
-            <w:pPr>
-              <w:pStyle w:val="Compact"/>
-            </w:pPr>
-          </w:p>
-        </w:tc>
-        <w:tc>
-          <w:tcPr/>
-          <w:p>
-            <w:pPr>
-              <w:pStyle w:val="Compact"/>
-            </w:pPr>
-          </w:p>
-        </w:tc>
-      </w:tr>
-      <w:tr>
-        <w:tc>
-          <w:tcPr/>
-          <w:p>
-            <w:pPr>
-              <w:pStyle w:val="Compact"/>
-              <w:jc w:val="left"/>
-            </w:pPr>
-            <w:r>
-              <w:t xml:space="preserve">Widowed</w:t>
-            </w:r>
-          </w:p>
-        </w:tc>
-        <w:tc>
-          <w:tcPr/>
-          <w:p>
-            <w:pPr>
-              <w:pStyle w:val="Compact"/>
-              <w:jc w:val="right"/>
-            </w:pPr>
-            <w:r>
-              <w:t xml:space="preserve">2</w:t>
-            </w:r>
-          </w:p>
-        </w:tc>
-        <w:tc>
-          <w:tcPr/>
-          <w:p>
-            <w:pPr>
-              <w:pStyle w:val="Compact"/>
-              <w:jc w:val="right"/>
-            </w:pPr>
-            <w:r>
-              <w:t xml:space="preserve">1.3</w:t>
-            </w:r>
-          </w:p>
-        </w:tc>
-        <w:tc>
-          <w:tcPr/>
-          <w:p>
-            <w:pPr>
-              <w:pStyle w:val="Compact"/>
-            </w:pPr>
-          </w:p>
-        </w:tc>
-        <w:tc>
-          <w:tcPr/>
-          <w:p>
-            <w:pPr>
-              <w:pStyle w:val="Compact"/>
-            </w:pPr>
-          </w:p>
-        </w:tc>
-        <w:tc>
-          <w:tcPr/>
-          <w:p>
-            <w:pPr>
-              <w:pStyle w:val="Compact"/>
-            </w:pPr>
-          </w:p>
-        </w:tc>
-      </w:tr>
-      <w:tr>
-        <w:tc>
-          <w:tcPr/>
-          <w:p>
-            <w:pPr>
-              <w:pStyle w:val="Compact"/>
-              <w:jc w:val="left"/>
-            </w:pPr>
-            <w:r>
-              <w:t xml:space="preserve">DSM-5 AUD Symptom Count</w:t>
-            </w:r>
-          </w:p>
-        </w:tc>
-        <w:tc>
-          <w:tcPr/>
-          <w:p>
-            <w:pPr>
-              <w:pStyle w:val="Compact"/>
-            </w:pPr>
-          </w:p>
-        </w:tc>
-        <w:tc>
-          <w:tcPr/>
-          <w:p>
-            <w:pPr>
-              <w:pStyle w:val="Compact"/>
-            </w:pPr>
-          </w:p>
-        </w:tc>
-        <w:tc>
-          <w:tcPr/>
-          <w:p>
-            <w:pPr>
-              <w:pStyle w:val="Compact"/>
-              <w:jc w:val="left"/>
-            </w:pPr>
-            <w:r>
-              <w:t xml:space="preserve">8.9</w:t>
-            </w:r>
-          </w:p>
-        </w:tc>
-        <w:tc>
-          <w:tcPr/>
-          <w:p>
-            <w:pPr>
-              <w:pStyle w:val="Compact"/>
-              <w:jc w:val="left"/>
-            </w:pPr>
-            <w:r>
-              <w:t xml:space="preserve">1.9</w:t>
-            </w:r>
-          </w:p>
-        </w:tc>
-        <w:tc>
-          <w:tcPr/>
-          <w:p>
-            <w:pPr>
-              <w:pStyle w:val="Compact"/>
-              <w:jc w:val="left"/>
-            </w:pPr>
-            <w:r>
-              <w:t xml:space="preserve">4-11</w:t>
-            </w:r>
-          </w:p>
-        </w:tc>
-      </w:tr>
-      <w:tr>
-        <w:tc>
-          <w:tcPr/>
-          <w:p>
-            <w:pPr>
-              <w:pStyle w:val="Compact"/>
-              <w:jc w:val="left"/>
-            </w:pPr>
-            <w:r>
-              <w:t xml:space="preserve">Reported 1 or More Lapse During Study Period</w:t>
-            </w:r>
-          </w:p>
-        </w:tc>
-        <w:tc>
-          <w:tcPr/>
-          <w:p>
-            <w:pPr>
-              <w:pStyle w:val="Compact"/>
-            </w:pPr>
-          </w:p>
-        </w:tc>
-        <w:tc>
-          <w:tcPr/>
-          <w:p>
-            <w:pPr>
-              <w:pStyle w:val="Compact"/>
-            </w:pPr>
-          </w:p>
-        </w:tc>
-        <w:tc>
-          <w:tcPr/>
-          <w:p>
-            <w:pPr>
-              <w:pStyle w:val="Compact"/>
-            </w:pPr>
-          </w:p>
-        </w:tc>
-        <w:tc>
-          <w:tcPr/>
-          <w:p>
-            <w:pPr>
-              <w:pStyle w:val="Compact"/>
-            </w:pPr>
-          </w:p>
-        </w:tc>
-        <w:tc>
-          <w:tcPr/>
-          <w:p>
-            <w:pPr>
-              <w:pStyle w:val="Compact"/>
-            </w:pPr>
-          </w:p>
-        </w:tc>
-      </w:tr>
-      <w:tr>
-        <w:tc>
-          <w:tcPr/>
-          <w:p>
-            <w:pPr>
-              <w:pStyle w:val="Compact"/>
-              <w:jc w:val="left"/>
-            </w:pPr>
-            <w:r>
-              <w:t xml:space="preserve">Yes</w:t>
-            </w:r>
-          </w:p>
-        </w:tc>
-        <w:tc>
-          <w:tcPr/>
-          <w:p>
-            <w:pPr>
-              <w:pStyle w:val="Compact"/>
-              <w:jc w:val="right"/>
-            </w:pPr>
-            <w:r>
-              <w:t xml:space="preserve">84</w:t>
-            </w:r>
-          </w:p>
-        </w:tc>
-        <w:tc>
-          <w:tcPr/>
-          <w:p>
-            <w:pPr>
-              <w:pStyle w:val="Compact"/>
-              <w:jc w:val="right"/>
-            </w:pPr>
-            <w:r>
-              <w:t xml:space="preserve">55.6</w:t>
-            </w:r>
-          </w:p>
-        </w:tc>
-        <w:tc>
-          <w:tcPr/>
-          <w:p>
-            <w:pPr>
-              <w:pStyle w:val="Compact"/>
-            </w:pPr>
-          </w:p>
-        </w:tc>
-        <w:tc>
-          <w:tcPr/>
-          <w:p>
-            <w:pPr>
-              <w:pStyle w:val="Compact"/>
-            </w:pPr>
-          </w:p>
-        </w:tc>
-        <w:tc>
-          <w:tcPr/>
-          <w:p>
-            <w:pPr>
-              <w:pStyle w:val="Compact"/>
-            </w:pPr>
-          </w:p>
-        </w:tc>
-      </w:tr>
-      <w:tr>
-        <w:tc>
-          <w:tcPr/>
-          <w:p>
-            <w:pPr>
-              <w:pStyle w:val="Compact"/>
-              <w:jc w:val="left"/>
-            </w:pPr>
-            <w:r>
-              <w:t xml:space="preserve">No</w:t>
-            </w:r>
-          </w:p>
-        </w:tc>
-        <w:tc>
-          <w:tcPr/>
-          <w:p>
-            <w:pPr>
-              <w:pStyle w:val="Compact"/>
-              <w:jc w:val="right"/>
-            </w:pPr>
-            <w:r>
-              <w:t xml:space="preserve">67</w:t>
-            </w:r>
-          </w:p>
-        </w:tc>
-        <w:tc>
-          <w:tcPr/>
-          <w:p>
-            <w:pPr>
-              <w:pStyle w:val="Compact"/>
-              <w:jc w:val="right"/>
-            </w:pPr>
-            <w:r>
-              <w:t xml:space="preserve">44.4</w:t>
-            </w:r>
-          </w:p>
-        </w:tc>
-        <w:tc>
-          <w:tcPr/>
-          <w:p>
-            <w:pPr>
-              <w:pStyle w:val="Compact"/>
-            </w:pPr>
-          </w:p>
-        </w:tc>
-        <w:tc>
-          <w:tcPr/>
-          <w:p>
-            <w:pPr>
-              <w:pStyle w:val="Compact"/>
-            </w:pPr>
-          </w:p>
-        </w:tc>
-        <w:tc>
-          <w:tcPr/>
-          <w:p>
-            <w:pPr>
-              <w:pStyle w:val="Compact"/>
-            </w:pPr>
-          </w:p>
-        </w:tc>
-      </w:tr>
-      <w:tr>
-        <w:tc>
-          <w:tcPr/>
-          <w:p>
-            <w:pPr>
-              <w:pStyle w:val="Compact"/>
-              <w:jc w:val="left"/>
-            </w:pPr>
-            <w:r>
-              <w:t xml:space="preserve">Number of reported lapses</w:t>
-            </w:r>
-          </w:p>
-        </w:tc>
-        <w:tc>
-          <w:tcPr/>
-          <w:p>
-            <w:pPr>
-              <w:pStyle w:val="Compact"/>
-            </w:pPr>
-          </w:p>
-        </w:tc>
-        <w:tc>
-          <w:tcPr/>
-          <w:p>
-            <w:pPr>
-              <w:pStyle w:val="Compact"/>
-            </w:pPr>
-          </w:p>
-        </w:tc>
-        <w:tc>
-          <w:tcPr/>
-          <w:p>
-            <w:pPr>
-              <w:pStyle w:val="Compact"/>
-              <w:jc w:val="left"/>
-            </w:pPr>
-            <w:r>
-              <w:t xml:space="preserve">6.8</w:t>
-            </w:r>
-          </w:p>
-        </w:tc>
-        <w:tc>
-          <w:tcPr/>
-          <w:p>
-            <w:pPr>
-              <w:pStyle w:val="Compact"/>
-              <w:jc w:val="left"/>
-            </w:pPr>
-            <w:r>
-              <w:t xml:space="preserve">12</w:t>
-            </w:r>
-          </w:p>
-        </w:tc>
-        <w:tc>
-          <w:tcPr/>
-          <w:p>
-            <w:pPr>
-              <w:pStyle w:val="Compact"/>
-              <w:jc w:val="left"/>
-            </w:pPr>
-            <w:r>
-              <w:t xml:space="preserve">0-75</w:t>
-            </w:r>
-          </w:p>
-        </w:tc>
-      </w:tr>
-    </w:tbl>
-    <w:bookmarkEnd w:id="41"/>
-    <w:p>
-      <w:pPr>
-        <w:pStyle w:val="BodyText"/>
-      </w:pPr>
-      <w:r>
-        <w:rPr>
-          <w:vertAlign w:val="subscript"/>
-        </w:rPr>
-        <w:t xml:space="preserve">Source:</w:t>
-      </w:r>
-      <w:r>
-        <w:rPr>
-          <w:vertAlign w:val="subscript"/>
-        </w:rPr>
-        <w:t xml:space="preserve"> </w:t>
-      </w:r>
-      <w:hyperlink r:id="rId42">
-        <w:r>
-          <w:rPr>
-            <w:rStyle w:val="Hyperlink"/>
-            <w:vertAlign w:val="subscript"/>
-          </w:rPr>
-          <w:t xml:space="preserve">Make All Tables for Main Manuscript</w:t>
-        </w:r>
-      </w:hyperlink>
-    </w:p>
-    <w:bookmarkEnd w:id="43"/>
-    <w:bookmarkStart w:id="49" w:name="model-evaluation-1"/>
+    <w:bookmarkEnd w:id="42"/>
+    <w:bookmarkStart w:id="48" w:name="model-evaluation-1"/>
     <w:p>
       <w:pPr>
         <w:pStyle w:val="Heading3"/>
@@ -4271,7 +4170,7 @@
       <w:tr>
         <w:tc>
           <w:tcPr/>
-          <w:bookmarkStart w:id="47" w:name="fig-auroc"/>
+          <w:bookmarkStart w:id="46" w:name="fig-auroc"/>
           <w:p>
             <w:pPr>
               <w:pStyle w:val="Compact"/>
@@ -4282,18 +4181,18 @@
                 <wp:inline>
                   <wp:extent cx="5334000" cy="3810000"/>
                   <wp:effectExtent b="0" l="0" r="0" t="0"/>
-                  <wp:docPr descr="" title="" id="45" name="Picture"/>
+                  <wp:docPr descr="" title="" id="44" name="Picture"/>
                   <a:graphic>
                     <a:graphicData uri="http://schemas.openxmlformats.org/drawingml/2006/picture">
                       <pic:pic>
                         <pic:nvPicPr>
-                          <pic:cNvPr descr="index_files/figure-docx/notebooks-mak_figures-fig-auroc-output-1.png" id="46" name="Picture"/>
+                          <pic:cNvPr descr="index_files/figure-docx/notebooks-mak_figures-fig-auroc-output-1.png" id="45" name="Picture"/>
                           <pic:cNvPicPr>
                             <a:picLocks noChangeArrowheads="1" noChangeAspect="1"/>
                           </pic:cNvPicPr>
                         </pic:nvPicPr>
                         <pic:blipFill>
-                          <a:blip r:embed="rId44"/>
+                          <a:blip r:embed="rId43"/>
                           <a:stretch>
                             <a:fillRect/>
                           </a:stretch>
@@ -4333,7 +4232,7 @@
               <w:t xml:space="preserve">Figure 1: Posterior probability for auROC and Bayesian credible intervals by model. Dashed line indicates a model performing at chance.</w:t>
             </w:r>
           </w:p>
-          <w:bookmarkEnd w:id="47"/>
+          <w:bookmarkEnd w:id="46"/>
         </w:tc>
       </w:tr>
     </w:tbl>
@@ -4353,7 +4252,7 @@
         </w:rPr>
         <w:t xml:space="preserve"> </w:t>
       </w:r>
-      <w:hyperlink r:id="rId48">
+      <w:hyperlink r:id="rId47">
         <w:r>
           <w:rPr>
             <w:rStyle w:val="Hyperlink"/>
@@ -4363,23 +4262,41 @@
         </w:r>
       </w:hyperlink>
     </w:p>
+    <w:bookmarkEnd w:id="48"/>
+    <w:bookmarkStart w:id="51" w:name="model-comparisons-1"/>
+    <w:p>
+      <w:pPr>
+        <w:pStyle w:val="Heading3"/>
+      </w:pPr>
+      <w:r>
+        <w:t xml:space="preserve">Model Comparisons</w:t>
+      </w:r>
+    </w:p>
+    <w:bookmarkStart w:id="49" w:name="baseline-contrasts"/>
+    <w:p>
+      <w:pPr>
+        <w:pStyle w:val="Heading4"/>
+      </w:pPr>
+      <w:r>
+        <w:t xml:space="preserve">Baseline Contrasts</w:t>
+      </w:r>
+    </w:p>
+    <w:p>
+      <w:pPr>
+        <w:pStyle w:val="FirstParagraph"/>
+      </w:pPr>
+      <w:r>
+        <w:t xml:space="preserve">The median decrease in auROC for the baseline vs. 24 hour lag model was 0.007 (95% CI=[0.001-0.012]), yielding a significant probability of 0.977 that the lagged model had worse performance. The median decrease in auROC for the baseline vs. 72 hour model was 0.018 (95% CI=[0.012-0.024]), yielding a significant probability of 1.000 that the lagged model had worse performance. The median increase in auROC for the baseline vs. 168 hour lag model was 0.022 (95% CI=[0.016-0.028]), yielding a significant probability of 1.000 that the lagged model had worse performance. The median increase in auROC for the baseline vs. 336 hour lag model was 0.043 (95% CI=[0.036-0.051]), yielding a significant probability of 1.000 that the lagged model had worse performance.</w:t>
+      </w:r>
+    </w:p>
     <w:bookmarkEnd w:id="49"/>
-    <w:bookmarkStart w:id="52" w:name="model-comparisons-1"/>
-    <w:p>
-      <w:pPr>
-        <w:pStyle w:val="Heading3"/>
-      </w:pPr>
-      <w:r>
-        <w:t xml:space="preserve">Model Comparisons</w:t>
-      </w:r>
-    </w:p>
-    <w:bookmarkStart w:id="50" w:name="baseline-contrasts"/>
+    <w:bookmarkStart w:id="50" w:name="adjacent-contrasts"/>
     <w:p>
       <w:pPr>
         <w:pStyle w:val="Heading4"/>
       </w:pPr>
       <w:r>
-        <w:t xml:space="preserve">Baseline Contrasts</w:t>
+        <w:t xml:space="preserve">Adjacent Contrasts</w:t>
       </w:r>
     </w:p>
     <w:p>
@@ -4387,30 +4304,12 @@
         <w:pStyle w:val="FirstParagraph"/>
       </w:pPr>
       <w:r>
-        <w:t xml:space="preserve">The median decrease in auROC for the baseline vs. 24 hour lag model was 0.007 (95% CI=[0.001-0.012]), yielding a significant probability of 0.977 that the lagged model had worse performance. The median decrease in auROC for the baseline vs. 72 hour model was 0.018 (95% CI=[0.012-0.024]), yielding a significant probability of 1.000 that the lagged model had worse performance. The median increase in auROC for the baseline vs. 168 hour lag model was 0.022 (95% CI=[0.016-0.028]), yielding a significant probability of 1.000 that the lagged model had worse performance. The median increase in auROC for the baseline vs. 336 hour lag model was 0.043 (95% CI=[0.036-0.051]), yielding a significant probability of 1.000 that the lagged model had worse performance.</w:t>
+        <w:t xml:space="preserve">The median decrease in auROC for the 24 hour vs. 72 hour lag model was 0.012 (95% CI=[0.006-0.018]), yielding a significant probability of 1.000 that the 72 hour lag model had worse performance than the 24 hour lag model. The median decrease in auROC for the 72 hour vs. 168 hour lag model was 0.004 (95% CI=[-0.002-0.010]), yielding a non-significant probability of 0.840 that the 168 hour lag model had worse performance than the 72 hour lag model. The median decrease in auROC for the 168 hour vs. 336 hour lag model was 0.021 (95% CI=[0.014-0.028]), yielding a significant probability of 1.000 that the 336 hour lag model had worse performance than the 168 hour lag model.</w:t>
       </w:r>
     </w:p>
     <w:bookmarkEnd w:id="50"/>
-    <w:bookmarkStart w:id="51" w:name="adjacent-contrasts"/>
-    <w:p>
-      <w:pPr>
-        <w:pStyle w:val="Heading4"/>
-      </w:pPr>
-      <w:r>
-        <w:t xml:space="preserve">Adjacent Contrasts</w:t>
-      </w:r>
-    </w:p>
-    <w:p>
-      <w:pPr>
-        <w:pStyle w:val="FirstParagraph"/>
-      </w:pPr>
-      <w:r>
-        <w:t xml:space="preserve">The median decrease in auROC for the 24 hour vs. 72 hour lag model was 0.012 (95% CI=[0.006-0.018]), yielding a significant probability of 1.000 that the 72 hour lag model had worse performance than the 24 hour lag model. The median decrease in auROC for the 72 hour vs. 168 hour lag model was 0.004 (95% CI=[-0.002-0.010]), yielding a non-significant probability of 0.840 that the 168 hour lag model had worse performance than the 72 hour lag model. The median decrease in auROC for the 168 hour vs. 336 hour lag model was 0.021 (95% CI=[0.014-0.028]), yielding a significant probability of 1.000 that the 336 hour lag model had worse performance than the 168 hour lag model.</w:t>
-      </w:r>
-    </w:p>
     <w:bookmarkEnd w:id="51"/>
-    <w:bookmarkEnd w:id="52"/>
-    <w:bookmarkStart w:id="58" w:name="fairness-benchmarks-1"/>
+    <w:bookmarkStart w:id="57" w:name="fairness-benchmarks-1"/>
     <w:p>
       <w:pPr>
         <w:pStyle w:val="Heading3"/>
@@ -4435,7 +4334,7 @@
         <w:t xml:space="preserve"> </w:t>
       </w:r>
       <w:r>
-        <w:t xml:space="preserve">shows the difference in performance of each model by demographic group. All group comparisons for race, sex, and income were significant (probability &gt; .95) across models. On average there was a median increase in auROC for white participants compared to participants who were not white of 0.159 (range 0.107-0.179). On average there was a median increase in auROC for male participants compared to female participants of 0.080 (range 0.059-0.116). On average there was a median increase in auROC for participants above the federal poverty line compared to participants below the federal poverty line of 0.092 (range 0.086-0.133).</w:t>
+        <w:t xml:space="preserve">shows the difference in performance of each model by demographic group. All group comparisons for race, sex at birth, and income were significant (probability &gt; .95) across models. On average there was a median increase in auROC for white participants compared to participants who were not white of 0.159 (range 0.107-0.179). On average there was a median increase in auROC for male participants compared to female participants of 0.080 (range 0.059-0.116). On average there was a median increase in auROC for participants above the federal poverty line compared to participants below the federal poverty line of 0.092 (range 0.086-0.133). A table of model performance for each demographic group separately by model can be found in the supplement.</w:t>
       </w:r>
     </w:p>
     <w:tbl>
@@ -4451,7 +4350,7 @@
       <w:tr>
         <w:tc>
           <w:tcPr/>
-          <w:bookmarkStart w:id="56" w:name="fig-fairness"/>
+          <w:bookmarkStart w:id="55" w:name="fig-fairness"/>
           <w:p>
             <w:pPr>
               <w:pStyle w:val="Compact"/>
@@ -4462,18 +4361,18 @@
                 <wp:inline>
                   <wp:extent cx="5334000" cy="3333749"/>
                   <wp:effectExtent b="0" l="0" r="0" t="0"/>
-                  <wp:docPr descr="" title="" id="54" name="Picture"/>
+                  <wp:docPr descr="" title="" id="53" name="Picture"/>
                   <a:graphic>
                     <a:graphicData uri="http://schemas.openxmlformats.org/drawingml/2006/picture">
                       <pic:pic>
                         <pic:nvPicPr>
-                          <pic:cNvPr descr="index_files/figure-docx/notebooks-mak_figures-fig-fairness-output-1.png" id="55" name="Picture"/>
+                          <pic:cNvPr descr="index_files/figure-docx/notebooks-mak_figures-fig-fairness-output-1.png" id="54" name="Picture"/>
                           <pic:cNvPicPr>
                             <a:picLocks noChangeArrowheads="1" noChangeAspect="1"/>
                           </pic:cNvPicPr>
                         </pic:nvPicPr>
                         <pic:blipFill>
-                          <a:blip r:embed="rId53"/>
+                          <a:blip r:embed="rId52"/>
                           <a:stretch>
                             <a:fillRect/>
                           </a:stretch>
@@ -4513,7 +4412,7 @@
               <w:t xml:space="preserve">Figure 2: Difference in auROCs by demographic group</w:t>
             </w:r>
           </w:p>
-          <w:bookmarkEnd w:id="56"/>
+          <w:bookmarkEnd w:id="55"/>
         </w:tc>
       </w:tr>
     </w:tbl>
@@ -4533,7 +4432,7 @@
         </w:rPr>
         <w:t xml:space="preserve"> </w:t>
       </w:r>
-      <w:hyperlink r:id="rId57">
+      <w:hyperlink r:id="rId56">
         <w:r>
           <w:rPr>
             <w:rStyle w:val="Hyperlink"/>
@@ -4543,19 +4442,19 @@
         </w:r>
       </w:hyperlink>
     </w:p>
+    <w:bookmarkEnd w:id="57"/>
+    <w:bookmarkStart w:id="58" w:name="feature-importance-1"/>
+    <w:p>
+      <w:pPr>
+        <w:pStyle w:val="Heading3"/>
+      </w:pPr>
+      <w:r>
+        <w:t xml:space="preserve">Feature Importance</w:t>
+      </w:r>
+    </w:p>
     <w:bookmarkEnd w:id="58"/>
-    <w:bookmarkStart w:id="59" w:name="feature-importance-1"/>
-    <w:p>
-      <w:pPr>
-        <w:pStyle w:val="Heading3"/>
-      </w:pPr>
-      <w:r>
-        <w:t xml:space="preserve">Feature Importance</w:t>
-      </w:r>
-    </w:p>
     <w:bookmarkEnd w:id="59"/>
-    <w:bookmarkEnd w:id="60"/>
-    <w:bookmarkStart w:id="61" w:name="discussion"/>
+    <w:bookmarkStart w:id="60" w:name="discussion"/>
     <w:p>
       <w:pPr>
         <w:pStyle w:val="Heading2"/>
@@ -4597,8 +4496,19 @@
         <w:t xml:space="preserve">Improving model performance for unprivileged classes. Considering other important classes for SUD, such as geographic location, Improving diversity of training data</w:t>
       </w:r>
     </w:p>
-    <w:bookmarkEnd w:id="61"/>
-    <w:bookmarkStart w:id="100" w:name="references"/>
+    <w:p>
+      <w:pPr>
+        <w:numPr>
+          <w:ilvl w:val="0"/>
+          <w:numId w:val="1003"/>
+        </w:numPr>
+      </w:pPr>
+      <w:r>
+        <w:t xml:space="preserve">Performance discrepancies sets up fairness methods paper. How can we improve these discrepancies? Mention in discussion as current future direction</w:t>
+      </w:r>
+    </w:p>
+    <w:bookmarkEnd w:id="60"/>
+    <w:bookmarkStart w:id="99" w:name="references"/>
     <w:p>
       <w:pPr>
         <w:pStyle w:val="Heading2"/>
@@ -4607,8 +4517,8 @@
         <w:t xml:space="preserve">References</w:t>
       </w:r>
     </w:p>
-    <w:bookmarkStart w:id="99" w:name="refs"/>
-    <w:bookmarkStart w:id="63" w:name="ref-baeMobilePhoneSensors2018"/>
+    <w:bookmarkStart w:id="98" w:name="refs"/>
+    <w:bookmarkStart w:id="62" w:name="ref-baeMobilePhoneSensors2018"/>
     <w:p>
       <w:pPr>
         <w:pStyle w:val="Bibliography"/>
@@ -4653,7 +4563,7 @@
       <w:r>
         <w:t xml:space="preserve"> </w:t>
       </w:r>
-      <w:hyperlink r:id="rId62">
+      <w:hyperlink r:id="rId61">
         <w:r>
           <w:rPr>
             <w:rStyle w:val="Hyperlink"/>
@@ -4665,8 +4575,8 @@
         <w:t xml:space="preserve">.</w:t>
       </w:r>
     </w:p>
-    <w:bookmarkEnd w:id="63"/>
-    <w:bookmarkStart w:id="65" w:name="ref-chtc"/>
+    <w:bookmarkEnd w:id="62"/>
+    <w:bookmarkStart w:id="64" w:name="ref-chtc"/>
     <w:p>
       <w:pPr>
         <w:pStyle w:val="Bibliography"/>
@@ -4689,7 +4599,7 @@
       <w:r>
         <w:t xml:space="preserve"> </w:t>
       </w:r>
-      <w:hyperlink r:id="rId64">
+      <w:hyperlink r:id="rId63">
         <w:r>
           <w:rPr>
             <w:rStyle w:val="Hyperlink"/>
@@ -4701,8 +4611,8 @@
         <w:t xml:space="preserve">.</w:t>
       </w:r>
     </w:p>
-    <w:bookmarkEnd w:id="65"/>
-    <w:bookmarkStart w:id="67" w:name="ref-chihPredictiveModelingAddiction2014"/>
+    <w:bookmarkEnd w:id="64"/>
+    <w:bookmarkStart w:id="66" w:name="ref-chihPredictiveModelingAddiction2014"/>
     <w:p>
       <w:pPr>
         <w:pStyle w:val="Bibliography"/>
@@ -4735,7 +4645,7 @@
       <w:r>
         <w:t xml:space="preserve"> </w:t>
       </w:r>
-      <w:hyperlink r:id="rId66">
+      <w:hyperlink r:id="rId65">
         <w:r>
           <w:rPr>
             <w:rStyle w:val="Hyperlink"/>
@@ -4747,8 +4657,8 @@
         <w:t xml:space="preserve">.</w:t>
       </w:r>
     </w:p>
-    <w:bookmarkEnd w:id="67"/>
-    <w:bookmarkStart w:id="69" w:name="ref-derubeisHistoryCurrentStatus2019"/>
+    <w:bookmarkEnd w:id="66"/>
+    <w:bookmarkStart w:id="68" w:name="ref-derubeisHistoryCurrentStatus2019"/>
     <w:p>
       <w:pPr>
         <w:pStyle w:val="Bibliography"/>
@@ -4781,7 +4691,7 @@
       <w:r>
         <w:t xml:space="preserve"> </w:t>
       </w:r>
-      <w:hyperlink r:id="rId68">
+      <w:hyperlink r:id="rId67">
         <w:r>
           <w:rPr>
             <w:rStyle w:val="Hyperlink"/>
@@ -4793,8 +4703,8 @@
         <w:t xml:space="preserve">.</w:t>
       </w:r>
     </w:p>
-    <w:bookmarkEnd w:id="69"/>
-    <w:bookmarkStart w:id="71" w:name="Xa203ab3abd150ead1a7854a9fa5726c8a273f52"/>
+    <w:bookmarkEnd w:id="68"/>
+    <w:bookmarkStart w:id="70" w:name="Xa203ab3abd150ead1a7854a9fa5726c8a273f52"/>
     <w:p>
       <w:pPr>
         <w:pStyle w:val="Bibliography"/>
@@ -4839,7 +4749,7 @@
       <w:r>
         <w:t xml:space="preserve"> </w:t>
       </w:r>
-      <w:hyperlink r:id="rId70">
+      <w:hyperlink r:id="rId69">
         <w:r>
           <w:rPr>
             <w:rStyle w:val="Hyperlink"/>
@@ -4851,8 +4761,8 @@
         <w:t xml:space="preserve">.</w:t>
       </w:r>
     </w:p>
-    <w:bookmarkEnd w:id="71"/>
-    <w:bookmarkStart w:id="72" w:name="ref-hsiehSampleSizeTables1989"/>
+    <w:bookmarkEnd w:id="70"/>
+    <w:bookmarkStart w:id="71" w:name="ref-hsiehSampleSizeTables1989"/>
     <w:p>
       <w:pPr>
         <w:pStyle w:val="Bibliography"/>
@@ -4883,8 +4793,8 @@
         <w:t xml:space="preserve">8: 795–802.</w:t>
       </w:r>
     </w:p>
-    <w:bookmarkEnd w:id="72"/>
-    <w:bookmarkStart w:id="74" w:name="ref-kilaruIncidenceTreatmentOpioid2020"/>
+    <w:bookmarkEnd w:id="71"/>
+    <w:bookmarkStart w:id="73" w:name="ref-kilaruIncidenceTreatmentOpioid2020"/>
     <w:p>
       <w:pPr>
         <w:pStyle w:val="Bibliography"/>
@@ -4950,7 +4860,7 @@
       <w:r>
         <w:t xml:space="preserve"> </w:t>
       </w:r>
-      <w:hyperlink r:id="rId73">
+      <w:hyperlink r:id="rId72">
         <w:r>
           <w:rPr>
             <w:rStyle w:val="Hyperlink"/>
@@ -4962,8 +4872,8 @@
         <w:t xml:space="preserve">.</w:t>
       </w:r>
     </w:p>
-    <w:bookmarkEnd w:id="74"/>
-    <w:bookmarkStart w:id="76" w:name="ref-kuhnAppliedPredictiveModeling2018"/>
+    <w:bookmarkEnd w:id="73"/>
+    <w:bookmarkStart w:id="75" w:name="ref-kuhnAppliedPredictiveModeling2018"/>
     <w:p>
       <w:pPr>
         <w:pStyle w:val="Bibliography"/>
@@ -5001,7 +4911,7 @@
       <w:r>
         <w:t xml:space="preserve"> </w:t>
       </w:r>
-      <w:hyperlink r:id="rId75">
+      <w:hyperlink r:id="rId74">
         <w:r>
           <w:rPr>
             <w:rStyle w:val="Hyperlink"/>
@@ -5013,24 +4923,24 @@
         <w:t xml:space="preserve">.</w:t>
       </w:r>
     </w:p>
+    <w:bookmarkEnd w:id="75"/>
+    <w:bookmarkStart w:id="76" w:name="ref-kuhnTidymodelsCollectionPackages2020"/>
+    <w:p>
+      <w:pPr>
+        <w:pStyle w:val="Bibliography"/>
+      </w:pPr>
+      <w:r>
+        <w:t xml:space="preserve">Kuhn, Max, and Hadley Wickham. 2020.</w:t>
+      </w:r>
+      <w:r>
+        <w:t xml:space="preserve"> </w:t>
+      </w:r>
+      <w:r>
+        <w:t xml:space="preserve">“Tidymodels: A Collection of Packages for Modeling and Machine Learning Using Tidyverse Principles.”</w:t>
+      </w:r>
+    </w:p>
     <w:bookmarkEnd w:id="76"/>
-    <w:bookmarkStart w:id="77" w:name="ref-kuhnTidymodelsCollectionPackages2020"/>
-    <w:p>
-      <w:pPr>
-        <w:pStyle w:val="Bibliography"/>
-      </w:pPr>
-      <w:r>
-        <w:t xml:space="preserve">Kuhn, Max, and Hadley Wickham. 2020.</w:t>
-      </w:r>
-      <w:r>
-        <w:t xml:space="preserve"> </w:t>
-      </w:r>
-      <w:r>
-        <w:t xml:space="preserve">“Tidymodels: A Collection of Packages for Modeling and Machine Learning Using Tidyverse Principles.”</w:t>
-      </w:r>
-    </w:p>
-    <w:bookmarkEnd w:id="77"/>
-    <w:bookmarkStart w:id="79" w:name="ref-kullSigmoidsHowObtain2017"/>
+    <w:bookmarkStart w:id="78" w:name="ref-kullSigmoidsHowObtain2017"/>
     <w:p>
       <w:pPr>
         <w:pStyle w:val="Bibliography"/>
@@ -5075,7 +4985,7 @@
       <w:r>
         <w:t xml:space="preserve"> </w:t>
       </w:r>
-      <w:hyperlink r:id="rId78">
+      <w:hyperlink r:id="rId77">
         <w:r>
           <w:rPr>
             <w:rStyle w:val="Hyperlink"/>
@@ -5087,8 +4997,8 @@
         <w:t xml:space="preserve">.</w:t>
       </w:r>
     </w:p>
-    <w:bookmarkEnd w:id="79"/>
-    <w:bookmarkStart w:id="80" w:name="X34be55f2a2ff67a14e7206627bb93b426490c87"/>
+    <w:bookmarkEnd w:id="78"/>
+    <w:bookmarkStart w:id="79" w:name="X34be55f2a2ff67a14e7206627bb93b426490c87"/>
     <w:p>
       <w:pPr>
         <w:pStyle w:val="Bibliography"/>
@@ -5173,8 +5083,8 @@
         <w:t xml:space="preserve">’17. Red Hook, NY, USA: Curran Associates Inc.</w:t>
       </w:r>
     </w:p>
-    <w:bookmarkEnd w:id="80"/>
-    <w:bookmarkStart w:id="81" w:name="X0900e084d2d8751b94683f82b04534ea811d54e"/>
+    <w:bookmarkEnd w:id="79"/>
+    <w:bookmarkStart w:id="80" w:name="X0900e084d2d8751b94683f82b04534ea811d54e"/>
     <w:p>
       <w:pPr>
         <w:pStyle w:val="Bibliography"/>
@@ -5287,8 +5197,8 @@
         <w:t xml:space="preserve">. First edition. New York: The Guilford Press.</w:t>
       </w:r>
     </w:p>
-    <w:bookmarkEnd w:id="81"/>
-    <w:bookmarkStart w:id="83" w:name="ref-olfsonHealthcareCoverageService2022"/>
+    <w:bookmarkEnd w:id="80"/>
+    <w:bookmarkStart w:id="82" w:name="ref-olfsonHealthcareCoverageService2022"/>
     <w:p>
       <w:pPr>
         <w:pStyle w:val="Bibliography"/>
@@ -5321,7 +5231,7 @@
       <w:r>
         <w:t xml:space="preserve"> </w:t>
       </w:r>
-      <w:hyperlink r:id="rId82">
+      <w:hyperlink r:id="rId81">
         <w:r>
           <w:rPr>
             <w:rStyle w:val="Hyperlink"/>
@@ -5333,8 +5243,8 @@
         <w:t xml:space="preserve">.</w:t>
       </w:r>
     </w:p>
-    <w:bookmarkEnd w:id="83"/>
-    <w:bookmarkStart w:id="85" w:name="ref-pinedoCurrentReexaminationRacial2019"/>
+    <w:bookmarkEnd w:id="82"/>
+    <w:bookmarkStart w:id="84" w:name="ref-pinedoCurrentReexaminationRacial2019"/>
     <w:p>
       <w:pPr>
         <w:pStyle w:val="Bibliography"/>
@@ -5379,7 +5289,7 @@
       <w:r>
         <w:t xml:space="preserve"> </w:t>
       </w:r>
-      <w:hyperlink r:id="rId84">
+      <w:hyperlink r:id="rId83">
         <w:r>
           <w:rPr>
             <w:rStyle w:val="Hyperlink"/>
@@ -5391,8 +5301,8 @@
         <w:t xml:space="preserve">.</w:t>
       </w:r>
     </w:p>
-    <w:bookmarkEnd w:id="85"/>
-    <w:bookmarkStart w:id="86" w:name="Xa6ef1c5c979e7476d6234b79f6a74545fbd7694"/>
+    <w:bookmarkEnd w:id="84"/>
+    <w:bookmarkStart w:id="85" w:name="Xa6ef1c5c979e7476d6234b79f6a74545fbd7694"/>
     <w:p>
       <w:pPr>
         <w:pStyle w:val="Bibliography"/>
@@ -5435,8 +5345,8 @@
         <w:t xml:space="preserve">58 (1): 7–29.</w:t>
       </w:r>
     </w:p>
-    <w:bookmarkEnd w:id="86"/>
-    <w:bookmarkStart w:id="88" w:name="Xd4c1d027f60920f356af6131267e679804e946e"/>
+    <w:bookmarkEnd w:id="85"/>
+    <w:bookmarkStart w:id="87" w:name="Xd4c1d027f60920f356af6131267e679804e946e"/>
     <w:p>
       <w:pPr>
         <w:pStyle w:val="Bibliography"/>
@@ -5481,7 +5391,7 @@
       <w:r>
         <w:t xml:space="preserve"> </w:t>
       </w:r>
-      <w:hyperlink r:id="rId87">
+      <w:hyperlink r:id="rId86">
         <w:r>
           <w:rPr>
             <w:rStyle w:val="Hyperlink"/>
@@ -5493,8 +5403,8 @@
         <w:t xml:space="preserve">.</w:t>
       </w:r>
     </w:p>
-    <w:bookmarkEnd w:id="88"/>
-    <w:bookmarkStart w:id="90" w:name="ref-waltersUsingMachineLearning2021"/>
+    <w:bookmarkEnd w:id="87"/>
+    <w:bookmarkStart w:id="89" w:name="ref-waltersUsingMachineLearning2021"/>
     <w:p>
       <w:pPr>
         <w:pStyle w:val="Bibliography"/>
@@ -5527,7 +5437,7 @@
       <w:r>
         <w:t xml:space="preserve"> </w:t>
       </w:r>
-      <w:hyperlink r:id="rId89">
+      <w:hyperlink r:id="rId88">
         <w:r>
           <w:rPr>
             <w:rStyle w:val="Hyperlink"/>
@@ -5539,8 +5449,8 @@
         <w:t xml:space="preserve">.</w:t>
       </w:r>
     </w:p>
-    <w:bookmarkEnd w:id="90"/>
-    <w:bookmarkStart w:id="92" w:name="X4446e184b7dd55a61fd406499f32542fdcf24b5"/>
+    <w:bookmarkEnd w:id="89"/>
+    <w:bookmarkStart w:id="91" w:name="X4446e184b7dd55a61fd406499f32542fdcf24b5"/>
     <w:p>
       <w:pPr>
         <w:pStyle w:val="Bibliography"/>
@@ -5585,7 +5495,7 @@
       <w:r>
         <w:t xml:space="preserve"> </w:t>
       </w:r>
-      <w:hyperlink r:id="rId91">
+      <w:hyperlink r:id="rId90">
         <w:r>
           <w:rPr>
             <w:rStyle w:val="Hyperlink"/>
@@ -5597,8 +5507,8 @@
         <w:t xml:space="preserve">.</w:t>
       </w:r>
     </w:p>
-    <w:bookmarkEnd w:id="92"/>
-    <w:bookmarkStart w:id="94" w:name="X254a0f87701f835b5365990b3eba45be7dca59c"/>
+    <w:bookmarkEnd w:id="91"/>
+    <w:bookmarkStart w:id="93" w:name="X254a0f87701f835b5365990b3eba45be7dca59c"/>
     <w:p>
       <w:pPr>
         <w:pStyle w:val="Bibliography"/>
@@ -5682,7 +5592,7 @@
       <w:r>
         <w:t xml:space="preserve"> </w:t>
       </w:r>
-      <w:hyperlink r:id="rId93">
+      <w:hyperlink r:id="rId92">
         <w:r>
           <w:rPr>
             <w:rStyle w:val="Hyperlink"/>
@@ -5694,8 +5604,8 @@
         <w:t xml:space="preserve">.</w:t>
       </w:r>
     </w:p>
-    <w:bookmarkEnd w:id="94"/>
-    <w:bookmarkStart w:id="96" w:name="Xb35ee182d565575e339a0170868456c1684f821"/>
+    <w:bookmarkEnd w:id="93"/>
+    <w:bookmarkStart w:id="95" w:name="Xb35ee182d565575e339a0170868456c1684f821"/>
     <w:p>
       <w:pPr>
         <w:pStyle w:val="Bibliography"/>
@@ -5746,7 +5656,7 @@
       <w:r>
         <w:t xml:space="preserve"> </w:t>
       </w:r>
-      <w:hyperlink r:id="rId95">
+      <w:hyperlink r:id="rId94">
         <w:r>
           <w:rPr>
             <w:rStyle w:val="Hyperlink"/>
@@ -5758,8 +5668,8 @@
         <w:t xml:space="preserve">.</w:t>
       </w:r>
     </w:p>
-    <w:bookmarkEnd w:id="96"/>
-    <w:bookmarkStart w:id="98" w:name="ref-wyantMachineLearningModels2023"/>
+    <w:bookmarkEnd w:id="95"/>
+    <w:bookmarkStart w:id="97" w:name="ref-wyantMachineLearningModels2023"/>
     <w:p>
       <w:pPr>
         <w:pStyle w:val="Bibliography"/>
@@ -5789,7 +5699,7 @@
       <w:r>
         <w:t xml:space="preserve"> </w:t>
       </w:r>
-      <w:hyperlink r:id="rId97">
+      <w:hyperlink r:id="rId96">
         <w:r>
           <w:rPr>
             <w:rStyle w:val="Hyperlink"/>
@@ -5801,10 +5711,10 @@
         <w:t xml:space="preserve">.</w:t>
       </w:r>
     </w:p>
+    <w:bookmarkEnd w:id="97"/>
     <w:bookmarkEnd w:id="98"/>
     <w:bookmarkEnd w:id="99"/>
     <w:bookmarkEnd w:id="100"/>
-    <w:bookmarkEnd w:id="101"/>
     <w:sectPr/>
   </w:body>
 </w:document>
@@ -5827,6 +5737,25 @@
     <w:p>
       <w:r>
         <w:separator/>
+      </w:r>
+    </w:p>
+  </w:footnote>
+  <w:footnote w:id="35">
+    <w:p>
+      <w:pPr>
+        <w:pStyle w:val="FootnoteText"/>
+      </w:pPr>
+      <w:r>
+        <w:rPr>
+          <w:rStyle w:val="FootnoteReference"/>
+        </w:rPr>
+        <w:footnoteRef/>
+      </w:r>
+      <w:r>
+        <w:t xml:space="preserve"> </w:t>
+      </w:r>
+      <w:r>
+        <w:t xml:space="preserve">For our fairness evaluations, we altered our outer loop resampling method from 3 x 10 cross-validation to 6 x 5 cross-validation. This method still gave us 30 held out tests sets, but by splitting the data across fewer folds (i.e., 5 vs. 10) we were able to reduce the likelihood of the minority group being absent in any single fold.</w:t>
       </w:r>
     </w:p>
   </w:footnote>

</xml_diff>

<commit_message>
updates to methods for JC review
</commit_message>
<xml_diff>
--- a/docs/index.docx
+++ b/docs/index.docx
@@ -155,7 +155,7 @@
         <w:pStyle w:val="Date"/>
       </w:pPr>
       <w:r>
-        <w:t xml:space="preserve">2024-07-01</w:t>
+        <w:t xml:space="preserve">2024-07-02</w:t>
       </w:r>
     </w:p>
     <w:p>
@@ -357,7 +357,7 @@
         <w:t xml:space="preserve">(DeRubeis 2019)</w:t>
       </w:r>
       <w:r>
-        <w:t xml:space="preserve">. Traditionally, precision medicine seeks to answer</w:t>
+        <w:t xml:space="preserve">. Traditionally, precision medicine seeks to answer the question of</w:t>
       </w:r>
       <w:r>
         <w:t xml:space="preserve"> </w:t>
@@ -373,7 +373,7 @@
         <w:t xml:space="preserve"> </w:t>
       </w:r>
       <w:r>
-        <w:t xml:space="preserve">do we best treat a specific individual (e.g., which medication will work best for an individual given their unique background, preferences, and medical history)?</w:t>
+        <w:t xml:space="preserve">we best treat a specific individual, given their unique combination of genetic, lifestyle, and environmental characteristics (e.g., which medication is most effective for whom).</w:t>
       </w:r>
     </w:p>
     <w:p>
@@ -381,7 +381,23 @@
         <w:pStyle w:val="BodyText"/>
       </w:pPr>
       <w:r>
-        <w:t xml:space="preserve">Today, this approach is also applied to chronic mental health conditions (i.e., precision mental health), like depression, substance use disorders, and suicide. However, mental health conditions are complex fluctuating processes. Unlike medical conditions that have clear biological precursors, mental health conditions are products of lots of psychosocial factors. These factors differ between individuals and within an individual over time. Additionally, there are a wide array of psychosocial supports available for clinicians to select from. Thus, precision mental health must consider both the</w:t>
+        <w:t xml:space="preserve">Today, this approach is also applied to chronic mental health conditions (i.e., precision mental health) such as depression, substance use disorders, and suicide. However, mental health conditions are complex, fluctuating processes. Unlike medical conditions that have clear biological precursors, mental health conditions are products of numerous psychosocial factors. These factors differ between individuals and can change within an individual over time. Additionally, there is a wide array of psychosocial supports available for clinicians to choose from. Thus, precision mental health must consider both the</w:t>
+      </w:r>
+      <w:r>
+        <w:t xml:space="preserve"> </w:t>
+      </w:r>
+      <w:r>
+        <w:rPr>
+          <w:i/>
+          <w:iCs/>
+        </w:rPr>
+        <w:t xml:space="preserve">how</w:t>
+      </w:r>
+      <w:r>
+        <w:t xml:space="preserve"> </w:t>
+      </w:r>
+      <w:r>
+        <w:t xml:space="preserve">and the</w:t>
       </w:r>
       <w:r>
         <w:t xml:space="preserve"> </w:t>
@@ -397,7 +413,33 @@
         <w:t xml:space="preserve"> </w:t>
       </w:r>
       <w:r>
-        <w:t xml:space="preserve">and the</w:t>
+        <w:t xml:space="preserve">(e.g., which treatment is most effective for whom at what moment).</w:t>
+      </w:r>
+    </w:p>
+    <w:p>
+      <w:pPr>
+        <w:pStyle w:val="BodyText"/>
+      </w:pPr>
+      <w:r>
+        <w:t xml:space="preserve">There has been long-standing interest in precision mental health and substance use disorders. An early example is the Project MATCH research group, which attempted to match individuals with alcohol use disorder to their optimal treatment based on baseline measures of individual characteristics</w:t>
+      </w:r>
+      <w:r>
+        <w:t xml:space="preserve"> </w:t>
+      </w:r>
+      <w:r>
+        <w:t xml:space="preserve">(Project Match Research Group 1997)</w:t>
+      </w:r>
+      <w:r>
+        <w:t xml:space="preserve">. The study did not find any differences in treatment success. This can likely be attributed to low-dimensional analyses that failed to capture the complex and heterogeneous nature of substance use disorders and their use of static distal features to predict a non-linear, time-varying course of recovery, lapse, and relapse</w:t>
+      </w:r>
+      <w:r>
+        <w:t xml:space="preserve"> </w:t>
+      </w:r>
+      <w:r>
+        <w:t xml:space="preserve">(Witkiewitz and Marlatt 2007)</w:t>
+      </w:r>
+      <w:r>
+        <w:t xml:space="preserve">. In other words, they used overly simplistic models to address the question of</w:t>
       </w:r>
       <w:r>
         <w:t xml:space="preserve"> </w:t>
@@ -410,6 +452,22 @@
         <w:t xml:space="preserve">how</w:t>
       </w:r>
       <w:r>
+        <w:t xml:space="preserve"> </w:t>
+      </w:r>
+      <w:r>
+        <w:t xml:space="preserve">and did not consider the question of</w:t>
+      </w:r>
+      <w:r>
+        <w:t xml:space="preserve"> </w:t>
+      </w:r>
+      <w:r>
+        <w:rPr>
+          <w:i/>
+          <w:iCs/>
+        </w:rPr>
+        <w:t xml:space="preserve">when</w:t>
+      </w:r>
+      <w:r>
         <w:t xml:space="preserve">.</w:t>
       </w:r>
     </w:p>
@@ -418,25 +476,7 @@
         <w:pStyle w:val="BodyText"/>
       </w:pPr>
       <w:r>
-        <w:t xml:space="preserve">There has been long-standing interest in precision mental health and substance use disorders. In an early example, The Project MATCH research group attempted to match individuals with alcohol use disorder to their optimal treatment based on baseline measures of individual differences</w:t>
-      </w:r>
-      <w:r>
-        <w:t xml:space="preserve"> </w:t>
-      </w:r>
-      <w:r>
-        <w:t xml:space="preserve">(Project Match Research Group 1997)</w:t>
-      </w:r>
-      <w:r>
-        <w:t xml:space="preserve">. The study failed to find any differences in treatment success. This can likely be attributed to low dimensional analyses that failed to capture to the complex and heterogeneous nature of substance use disorders and their use of static distal features to predict a non-linear time-varying course of recovery, lapse, and relapse</w:t>
-      </w:r>
-      <w:r>
-        <w:t xml:space="preserve"> </w:t>
-      </w:r>
-      <w:r>
-        <w:t xml:space="preserve">(Witkiewitz and Marlatt 2007)</w:t>
-      </w:r>
-      <w:r>
-        <w:t xml:space="preserve">.</w:t>
+        <w:t xml:space="preserve">Take the example of lapses, discrete instances of goal inconsistent substance use. Lapses are a clinically important target for substance use treatment. They are often an early warning sign of relapse, maladaptive responses to lapses can undermine recovery, and for some substances a single lapse can result in an overdose and/or death. It would be unreasonable to expect that we could predict a lapse with any temporal precision using only features that become more distal as time progresses. On the contrary, lapse prediction requires dense, long-term monitoring of symptoms and related states proximal to the outcome.</w:t>
       </w:r>
     </w:p>
     <w:p>
@@ -444,15 +484,7 @@
         <w:pStyle w:val="BodyText"/>
       </w:pPr>
       <w:r>
-        <w:t xml:space="preserve">Take the example of lapses, discrete instances of goal inconsistent substance use. Lapses are a clinically important target for substance use treatment. They are often an early warning sign of relapse, maladaptive responses to lapses can undermine recovery, and for some substances a single lapse can result in an overdose and/or death. It would be unreasonable to expect that we could predict a lapse with any temporal precision using only features that become more distal as time progresses. On the contrary, lapse prediction requires dense, long-term monitoring of symptoms and related states proximal to the outcome.</w:t>
-      </w:r>
-    </w:p>
-    <w:p>
-      <w:pPr>
-        <w:pStyle w:val="BodyText"/>
-      </w:pPr>
-      <w:r>
-        <w:t xml:space="preserve">Recent advances in both personal sensing and machine learning may address both of these barriers to successful precision mental health. Personal sensing allows for frequent, longitudinal measurement of changes in proximal risk (e.g., lapse) with high temporal precision. Machine learning allows for high dimensional inputs. Moreover, tools from machine learning can be applied to models to understand which factors are specific to a specific individual at a specific moment in time.</w:t>
+        <w:t xml:space="preserve">Recent advances in both personal sensing and machine learning may address these barriers to successful precision mental health. Personal sensing allows for frequent, longitudinal measurement of changes in proximal risk (e.g., lapse) with high temporal precision. Machine learning allows for high dimensional inputs. Moreover, tools from machine learning can be applied to models to understand which factors are specific to a specific individual at a specific moment in time.</w:t>
       </w:r>
     </w:p>
     <w:p>
@@ -737,13 +769,13 @@
       </w:r>
     </w:p>
     <w:bookmarkEnd w:id="26"/>
-    <w:bookmarkStart w:id="27" w:name="individual-differences"/>
+    <w:bookmarkStart w:id="27" w:name="individual-characteristics"/>
     <w:p>
       <w:pPr>
         <w:pStyle w:val="Heading3"/>
       </w:pPr>
       <w:r>
-        <w:t xml:space="preserve">Individual Differences</w:t>
+        <w:t xml:space="preserve">Individual Characteristics</w:t>
       </w:r>
     </w:p>
     <w:p>
@@ -751,7 +783,7 @@
         <w:pStyle w:val="FirstParagraph"/>
       </w:pPr>
       <w:r>
-        <w:t xml:space="preserve">We collected self-report information about demographics (age, sex, race, ethnicity, education, marital status, employment, and income) and AUD symptom count. This information was collected primarily to characterize the sample and to evaluate the diversity of the training data. We also used the demographic information in our models.</w:t>
+        <w:t xml:space="preserve">We collected self-report information about demographics (age, sex, race, ethnicity, education, marital status, employment, and income) and AUD symptom count.</w:t>
       </w:r>
     </w:p>
     <w:bookmarkEnd w:id="27"/>
@@ -879,7 +911,7 @@
         <w:pStyle w:val="FirstParagraph"/>
       </w:pPr>
       <w:r>
-        <w:t xml:space="preserve">Features were calculated using only data collected before the start of each prediction window to ensure our models were making true future predictions. For our no lag models this included all data prior to the hour of the start of the prediction window. For our lagged models, the last EMA data used for feature engineering were collected up to one day, three days, one week, or two weeks prior to the start of the prediction window.</w:t>
+        <w:t xml:space="preserve">Features were calculated using only data collected before the start of each prediction window to ensure our models were making true future predictions. For our no lag models this included all data prior to the hour of the start of the prediction window. For our lagged models, the last EMA data used for feature engineering were collected up to 24 hours, 72 hours, 168 hours, or 336 hours prior to the start of the prediction window.</w:t>
       </w:r>
     </w:p>
     <w:p>
@@ -887,7 +919,10 @@
         <w:pStyle w:val="BodyText"/>
       </w:pPr>
       <w:r>
-        <w:t xml:space="preserve">A total of 286 features were derived from three data sources:</w:t>
+        <w:t xml:space="preserve">A total of 279 features were derived from two data sources:</w:t>
+      </w:r>
+      <w:r>
+        <w:t xml:space="preserve"> </w:t>
       </w:r>
     </w:p>
     <w:p>
@@ -920,31 +955,10 @@
           <w:i/>
           <w:iCs/>
         </w:rPr>
-        <w:t xml:space="preserve">Day and time of prediction window onset</w:t>
-      </w:r>
-      <w:r>
-        <w:t xml:space="preserve">: We created dummy-coded features to indicate time of day and day of week that the prediction window began.</w:t>
-      </w:r>
-    </w:p>
-    <w:p>
-      <w:pPr>
-        <w:numPr>
-          <w:ilvl w:val="0"/>
-          <w:numId w:val="1002"/>
-        </w:numPr>
-      </w:pPr>
-      <w:r>
-        <w:rPr>
-          <w:i/>
-          <w:iCs/>
-        </w:rPr>
         <w:t xml:space="preserve">Previous EMA responses</w:t>
       </w:r>
       <w:r>
         <w:t xml:space="preserve">: We created raw EMA and change features for varying scoring epochs (i.e., 12, 24, 48, 72, and 168 hours) before the start of the prediction window for all EMA items. Raw features included min, max, and median scores for each EMA item across all EMAs in each epoch for that participant. We calculated change features by subtracting the participants’ overall mean score for each EMA item (using all EMAs collected before the start of the prediction window) from the associated raw feature. We also created raw and change features based on the most recent response for each EMA question and raw and change rate features from previously reported lapses and number of completed EMAs.</w:t>
-      </w:r>
-      <w:r>
-        <w:t xml:space="preserve"> </w:t>
       </w:r>
     </w:p>
     <w:p>
@@ -1099,7 +1113,7 @@
         <w:pStyle w:val="BodyText"/>
       </w:pPr>
       <w:r>
-        <w:t xml:space="preserve">Second, we compared each adjacent lagged model (i.e., 24 hours vs 72 hours, 72 hours vs. 168 hours, and 168 hours vs. 336 hours). These comparisons allow us to determine the probability that the lagged models systematically degrade as predictions are made further into the future.</w:t>
+        <w:t xml:space="preserve">Second, we compared each adjacent lagged model (i.e., 24 hours vs 72 hours, 72 hours vs. 168 hours, and 168 hours vs. 336 hours). These comparisons allow us to determine the probability that the lagged models systematically differed as predictions were made further into the future.</w:t>
       </w:r>
     </w:p>
     <w:p>
@@ -4452,6 +4466,47 @@
         <w:t xml:space="preserve">Feature Importance</w:t>
       </w:r>
     </w:p>
+    <w:p>
+      <w:pPr>
+        <w:pStyle w:val="FirstParagraph"/>
+      </w:pPr>
+      <w:r>
+        <w:t xml:space="preserve">Global importance (mean |Shapley value|) for feature categories for each model appears in Panel A of</w:t>
+      </w:r>
+      <w:r>
+        <w:t xml:space="preserve"> </w:t>
+      </w:r>
+      <w:hyperlink w:anchor="fig-shap">
+        <w:r>
+          <w:rPr>
+            <w:rStyle w:val="Hyperlink"/>
+          </w:rPr>
+          <w:t xml:space="preserve">Figure 3</w:t>
+        </w:r>
+      </w:hyperlink>
+      <w:r>
+        <w:t xml:space="preserve">. Consistent with previous models using similar features, past use was the most important feature category for lapse prediction across lagged models. Future abstinence efficacy was also globally important across window widths.</w:t>
+      </w:r>
+    </w:p>
+    <w:p>
+      <w:pPr>
+        <w:pStyle w:val="BodyText"/>
+      </w:pPr>
+      <w:r>
+        <w:t xml:space="preserve">Sina plots of local Shapley values show the influence of feature categories on individual observations by model (</w:t>
+      </w:r>
+      <w:hyperlink w:anchor="fig-shap">
+        <w:r>
+          <w:rPr>
+            <w:rStyle w:val="Hyperlink"/>
+          </w:rPr>
+          <w:t xml:space="preserve">Figure 3</w:t>
+        </w:r>
+      </w:hyperlink>
+      <w:r>
+        <w:t xml:space="preserve">, Panels B-D). The variance in feature importance for past use is widest in our immediate (no lag) model. Additionally, all EMA item categories appear to impact lapse probability for specific individuals at specific times even if they are not globally important across all observations.</w:t>
+      </w:r>
+    </w:p>
     <w:tbl>
       <w:tblPr>
         <w:tblStyle w:val="Table"/>
@@ -4531,14 +4586,6 @@
         </w:tc>
       </w:tr>
     </w:tbl>
-    <w:p>
-      <w:pPr>
-        <w:pStyle w:val="BodyText"/>
-      </w:pPr>
-      <w:r>
-        <w:t xml:space="preserve">Global and Local Shapley values</w:t>
-      </w:r>
-    </w:p>
     <w:p>
       <w:pPr>
         <w:pStyle w:val="BodyText"/>

</xml_diff>